<commit_message>
feat: v2.0 — remove firewall/NMS, center on NetBox, add free public APIs, scale for 10-12 students
</commit_message>
<xml_diff>
--- a/Network_Automation_Bootcamp_Lab_Guide.docx
+++ b/Network_Automation_Bootcamp_Lab_Guide.docx
@@ -37,7 +37,7 @@
         <w:rPr>
           <w:sz w:val="22"/>
         </w:rPr>
-        <w:t>Version 1.0   |   May 2026</w:t>
+        <w:t>Version 2.0   |   May 2026   |   10–12 Students</w:t>
       </w:r>
     </w:p>
     <w:p>
@@ -58,7 +58,7 @@
     </w:p>
     <w:p>
       <w:r>
-        <w:t>The Network Automation Bootcamp is a hands-on lab environment designed to introduce network engineers to three core pillars of modern network automation: Git, Ansible, and REST APIs. Each section builds on the previous one, culminating in a fully automated change pipeline that can version-control, deploy, and verify network configurations across a heterogeneous device fleet.</w:t>
+        <w:t>The Network Automation Bootcamp is a hands-on lab designed for 10–12 network engineers. It covers three core pillars of modern network automation: Git, Ansible, and REST APIs. Students work on shared lab devices (two routers and one switch), a local NetBox instance as the source of truth, and several free public APIs to explore real-world data — no accounts or credit cards required.</w:t>
       </w:r>
     </w:p>
     <w:p>
@@ -77,7 +77,7 @@
         <w:pStyle w:val="ListBullet"/>
       </w:pPr>
       <w:r>
-        <w:t>Use Git to version-control network device configurations and manage change branches.</w:t>
+        <w:t>Track and roll back network configs using Git branches and merge requests.</w:t>
       </w:r>
     </w:p>
     <w:p>
@@ -85,7 +85,7 @@
         <w:pStyle w:val="ListBullet"/>
       </w:pPr>
       <w:r>
-        <w:t>Write Ansible playbooks that configure routers, switches, and firewalls at scale.</w:t>
+        <w:t>Write Ansible playbooks to configure routers and a switch at scale with Jinja2 templates.</w:t>
       </w:r>
     </w:p>
     <w:p>
@@ -93,7 +93,7 @@
         <w:pStyle w:val="ListBullet"/>
       </w:pPr>
       <w:r>
-        <w:t>Consume REST and RESTCONF APIs to query device state and push configuration programmatically.</w:t>
+        <w:t>Consume the NetBox REST API to query and update the source of truth.</w:t>
       </w:r>
     </w:p>
     <w:p>
@@ -101,7 +101,15 @@
         <w:pStyle w:val="ListBullet"/>
       </w:pPr>
       <w:r>
-        <w:t>Combine all three tools into a repeatable, auditable end-to-end automation workflow.</w:t>
+        <w:t>Query free public APIs (BGPView, PeeringDB, Cisco DevNet sandbox) to explore real BGP data.</w:t>
+      </w:r>
+    </w:p>
+    <w:p>
+      <w:pPr>
+        <w:pStyle w:val="ListBullet"/>
+      </w:pPr>
+      <w:r>
+        <w:t>Connect all three tools into a repeatable, auditable end-to-end change pipeline.</w:t>
       </w:r>
     </w:p>
     <w:p>
@@ -112,7 +120,75 @@
         <w:rPr>
           <w:color w:val="2E74B5"/>
         </w:rPr>
-        <w:t>1.2 Prerequisites</w:t>
+        <w:t>1.2 Student Setup</w:t>
+      </w:r>
+    </w:p>
+    <w:p>
+      <w:r>
+        <w:t>Each student receives:</w:t>
+      </w:r>
+    </w:p>
+    <w:p>
+      <w:pPr>
+        <w:pStyle w:val="ListBullet"/>
+      </w:pPr>
+      <w:r>
+        <w:t>A workstation IP in 10.0.0.101–112 (Pod-01 to Pod-12)</w:t>
+      </w:r>
+    </w:p>
+    <w:p>
+      <w:pPr>
+        <w:pStyle w:val="ListBullet"/>
+      </w:pPr>
+      <w:r>
+        <w:t>A personal Git branch:  student/pod-XX-yourname</w:t>
+      </w:r>
+    </w:p>
+    <w:p>
+      <w:pPr>
+        <w:pStyle w:val="ListBullet"/>
+      </w:pPr>
+      <w:r>
+        <w:t>A personal NetBox API token for the lab duration</w:t>
+      </w:r>
+    </w:p>
+    <w:p>
+      <w:pPr>
+        <w:pStyle w:val="ListBullet"/>
+      </w:pPr>
+      <w:r>
+        <w:t>SSH credentials for the shared lab devices</w:t>
+      </w:r>
+    </w:p>
+    <w:p>
+      <w:pPr>
+        <w:ind w:left="283"/>
+        <w:shd w:val="clear" w:color="auto" w:fill="EFEFEF"/>
+      </w:pPr>
+      <w:r>
+        <w:rPr>
+          <w:rFonts w:ascii="Courier New" w:hAnsi="Courier New"/>
+          <w:color w:val="1A1A1A"/>
+          <w:sz w:val="16"/>
+        </w:rPr>
+        <w:t>git clone http://10.0.0.60/bootcamp/Network-Automation-Bootcamp.git</w:t>
+        <w:br/>
+        <w:t>cd Network-Automation-Bootcamp</w:t>
+        <w:br/>
+        <w:t>git checkout -b student/pod-XX-yourname</w:t>
+        <w:br/>
+        <w:t>pip install ansible requests netmiko napalm pynetbox</w:t>
+      </w:r>
+    </w:p>
+    <w:p>
+      <w:pPr>
+        <w:pStyle w:val="Heading2"/>
+      </w:pPr>
+      <w:r>
+        <w:rPr>
+          <w:color w:val="2E74B5"/>
+        </w:rPr>
+        <w:t>1.3 Prerequisites</w:t>
       </w:r>
     </w:p>
     <w:tbl>
@@ -130,7 +206,7 @@
       <w:tr>
         <w:tc>
           <w:tcPr>
-            <w:tcW w:type="dxa" w:w="2880"/>
+            <w:tcW w:type="dxa" w:w="2592"/>
             <w:shd w:val="clear" w:color="auto" w:fill="1F4E79"/>
           </w:tcPr>
           <w:p>
@@ -145,7 +221,7 @@
         </w:tc>
         <w:tc>
           <w:tcPr>
-            <w:tcW w:type="dxa" w:w="2160"/>
+            <w:tcW w:type="dxa" w:w="1728"/>
             <w:shd w:val="clear" w:color="auto" w:fill="1F4E79"/>
           </w:tcPr>
           <w:p>
@@ -177,7 +253,7 @@
       <w:tr>
         <w:tc>
           <w:tcPr>
-            <w:tcW w:type="dxa" w:w="2880"/>
+            <w:tcW w:type="dxa" w:w="2592"/>
           </w:tcPr>
           <w:p>
             <w:r>
@@ -187,7 +263,7 @@
         </w:tc>
         <w:tc>
           <w:tcPr>
-            <w:tcW w:type="dxa" w:w="2160"/>
+            <w:tcW w:type="dxa" w:w="1728"/>
           </w:tcPr>
           <w:p>
             <w:r>
@@ -209,7 +285,7 @@
       <w:tr>
         <w:tc>
           <w:tcPr>
-            <w:tcW w:type="dxa" w:w="2880"/>
+            <w:tcW w:type="dxa" w:w="2592"/>
           </w:tcPr>
           <w:p>
             <w:r>
@@ -219,7 +295,7 @@
         </w:tc>
         <w:tc>
           <w:tcPr>
-            <w:tcW w:type="dxa" w:w="2160"/>
+            <w:tcW w:type="dxa" w:w="1728"/>
           </w:tcPr>
           <w:p>
             <w:r>
@@ -241,7 +317,7 @@
       <w:tr>
         <w:tc>
           <w:tcPr>
-            <w:tcW w:type="dxa" w:w="2880"/>
+            <w:tcW w:type="dxa" w:w="2592"/>
           </w:tcPr>
           <w:p>
             <w:r>
@@ -251,7 +327,7 @@
         </w:tc>
         <w:tc>
           <w:tcPr>
-            <w:tcW w:type="dxa" w:w="2160"/>
+            <w:tcW w:type="dxa" w:w="1728"/>
           </w:tcPr>
           <w:p>
             <w:r>
@@ -273,7 +349,7 @@
       <w:tr>
         <w:tc>
           <w:tcPr>
-            <w:tcW w:type="dxa" w:w="2880"/>
+            <w:tcW w:type="dxa" w:w="2592"/>
           </w:tcPr>
           <w:p>
             <w:r>
@@ -283,7 +359,7 @@
         </w:tc>
         <w:tc>
           <w:tcPr>
-            <w:tcW w:type="dxa" w:w="2160"/>
+            <w:tcW w:type="dxa" w:w="1728"/>
           </w:tcPr>
           <w:p>
             <w:r>
@@ -297,7 +373,7 @@
           </w:tcPr>
           <w:p>
             <w:r>
-              <w:t>HTTP client for REST API labs</w:t>
+              <w:t>HTTP client for REST/RESTCONF</w:t>
             </w:r>
           </w:p>
         </w:tc>
@@ -305,7 +381,7 @@
       <w:tr>
         <w:tc>
           <w:tcPr>
-            <w:tcW w:type="dxa" w:w="2880"/>
+            <w:tcW w:type="dxa" w:w="2592"/>
           </w:tcPr>
           <w:p>
             <w:r>
@@ -315,7 +391,7 @@
         </w:tc>
         <w:tc>
           <w:tcPr>
-            <w:tcW w:type="dxa" w:w="2160"/>
+            <w:tcW w:type="dxa" w:w="1728"/>
           </w:tcPr>
           <w:p>
             <w:r>
@@ -337,7 +413,7 @@
       <w:tr>
         <w:tc>
           <w:tcPr>
-            <w:tcW w:type="dxa" w:w="2880"/>
+            <w:tcW w:type="dxa" w:w="2592"/>
           </w:tcPr>
           <w:p>
             <w:r>
@@ -347,7 +423,7 @@
         </w:tc>
         <w:tc>
           <w:tcPr>
-            <w:tcW w:type="dxa" w:w="2160"/>
+            <w:tcW w:type="dxa" w:w="1728"/>
           </w:tcPr>
           <w:p>
             <w:r>
@@ -362,6 +438,38 @@
           <w:p>
             <w:r>
               <w:t>Device abstraction layer</w:t>
+            </w:r>
+          </w:p>
+        </w:tc>
+      </w:tr>
+      <w:tr>
+        <w:tc>
+          <w:tcPr>
+            <w:tcW w:type="dxa" w:w="2592"/>
+          </w:tcPr>
+          <w:p>
+            <w:r>
+              <w:t>pynetbox</w:t>
+            </w:r>
+          </w:p>
+        </w:tc>
+        <w:tc>
+          <w:tcPr>
+            <w:tcW w:type="dxa" w:w="1728"/>
+          </w:tcPr>
+          <w:p>
+            <w:r>
+              <w:t>latest</w:t>
+            </w:r>
+          </w:p>
+        </w:tc>
+        <w:tc>
+          <w:tcPr>
+            <w:tcW w:type="dxa" w:w="5040"/>
+          </w:tcPr>
+          <w:p>
+            <w:r>
+              <w:t>NetBox API Python wrapper</w:t>
             </w:r>
           </w:p>
         </w:tc>
@@ -381,88 +489,86 @@
     </w:p>
     <w:p>
       <w:r>
-        <w:t>The lab consists of a Control Node running on Linux that communicates with a set of network devices over the Management Network (10.0.0.0/24). An IPAM platform (NetBox) and a generic NMS/API endpoint complement the device layer.</w:t>
+        <w:t>The lab is divided into three networks: the classroom management network (10.0.0.0/24) where students, the control node, NetBox, and the Git server live; the device network (10.0.1.0/24) for the routers and switch; and the internet for free public API access.</w:t>
       </w:r>
     </w:p>
     <w:p>
       <w:pPr>
         <w:ind w:left="283"/>
-        <w:shd w:val="clear" w:color="auto" w:fill="F0F0F0"/>
+        <w:shd w:val="clear" w:color="auto" w:fill="EFEFEF"/>
       </w:pPr>
       <w:r>
         <w:rPr>
           <w:rFonts w:ascii="Courier New" w:hAnsi="Courier New"/>
-          <w:color w:val="202020"/>
+          <w:color w:val="1A1A1A"/>
           <w:sz w:val="16"/>
         </w:rPr>
-        <w:t xml:space="preserve">                        INTERNET</w:t>
+        <w:t xml:space="preserve">                         INTERNET</w:t>
         <w:br/>
-        <w:t xml:space="preserve">                            │</w:t>
+        <w:t xml:space="preserve">                             │</w:t>
         <w:br/>
-        <w:t xml:space="preserve">                     ┌──────┴──────┐</w:t>
+        <w:t xml:space="preserve">          ───────────────────┼──────────────────────</w:t>
         <w:br/>
-        <w:t xml:space="preserve">                     │  ISP EDGE   │</w:t>
+        <w:t xml:space="preserve">            FREE PUBLIC APIs (no account needed)</w:t>
         <w:br/>
-        <w:t xml:space="preserve">                     └──────┬──────┘</w:t>
+        <w:t xml:space="preserve">          ───────────────────┼──────────────────────</w:t>
         <w:br/>
-        <w:t xml:space="preserve">                            │ 203.0.113.2</w:t>
+        <w:t xml:space="preserve">          │                  │                      │</w:t>
         <w:br/>
-        <w:t xml:space="preserve">                     ┌──────┴──────────────────┐</w:t>
+        <w:t xml:space="preserve">  Cisco DevNet IOS-XE   BGPView API          PeeringDB</w:t>
         <w:br/>
-        <w:t xml:space="preserve">                     │        ROUTER-1          │</w:t>
+        <w:t xml:space="preserve">  (sandbox free)         (free)               (free)</w:t>
         <w:br/>
-        <w:t xml:space="preserve">                     │  Gi0/0: 203.0.113.1/30   │</w:t>
+        <w:t xml:space="preserve">          │                  │                      │</w:t>
         <w:br/>
-        <w:t xml:space="preserve">                     │  Gi0/1: 10.0.0.1/24      │</w:t>
+        <w:t xml:space="preserve">          └──────────────────┼──────────────────────┘</w:t>
         <w:br/>
-        <w:t xml:space="preserve">                     │  IOS-XE / OSPF Area 0    │</w:t>
+        <w:t xml:space="preserve">                             │ HTTPS</w:t>
         <w:br/>
-        <w:t xml:space="preserve">                     └──────┬──────────────────┘</w:t>
+        <w:t>═════════════════════════════╪══════════════════════════</w:t>
         <w:br/>
-        <w:t xml:space="preserve">                            │</w:t>
+        <w:t xml:space="preserve">         MGMT NETWORK  10.0.0.0/24</w:t>
         <w:br/>
-        <w:t xml:space="preserve">                     ┌──────┴──────────────────┐</w:t>
+        <w:t>═════════════════════════════╪══════════════════════════</w:t>
         <w:br/>
-        <w:t xml:space="preserve">                     │        SWITCH-1          │</w:t>
+        <w:t xml:space="preserve">                             │</w:t>
         <w:br/>
-        <w:t xml:space="preserve">                     │  VLAN 10/20/99           │</w:t>
+        <w:t xml:space="preserve">        ┌────────────────────┼───────────────┐</w:t>
         <w:br/>
-        <w:t xml:space="preserve">                     │  Mgmt: 10.0.0.10/24      │</w:t>
+        <w:t xml:space="preserve">        │                    │               │</w:t>
         <w:br/>
-        <w:t xml:space="preserve">                     └──────┬──────┬────────────┘</w:t>
+        <w:t xml:space="preserve"> CONTROL NODE          NETBOX           GIT SERVER</w:t>
         <w:br/>
-        <w:t xml:space="preserve">                  VLAN 10   │      │   VLAN 20</w:t>
+        <w:t xml:space="preserve"> 10.0.0.50             10.0.0.100       10.0.0.60</w:t>
         <w:br/>
-        <w:t xml:space="preserve">            ┌───────────────┘      └──────────────┐</w:t>
+        <w:t xml:space="preserve"> Git/Ansible/Python    :8000 (IPAM)     (Gitea)</w:t>
         <w:br/>
-        <w:t xml:space="preserve">      ┌─────┴──────┐                     ┌─────────┴──────┐</w:t>
+        <w:t xml:space="preserve">        │                    │</w:t>
         <w:br/>
-        <w:t xml:space="preserve">      │  SERVER-1  │                     │ WORKSTATION-1  │</w:t>
+        <w:t xml:space="preserve">        └──────────┬─────────┘</w:t>
         <w:br/>
-        <w:t xml:space="preserve">      │10.0.10.1/24│                     │ 10.0.20.1/24   │</w:t>
+        <w:t xml:space="preserve">                   │ SSH / RESTCONF / Ansible</w:t>
         <w:br/>
-        <w:t xml:space="preserve">      └────────────┘                     └────────────────┘</w:t>
+        <w:t>═══════════════════╪══════════════════════════════</w:t>
+        <w:br/>
+        <w:t xml:space="preserve">         DEVICE NETWORK  10.0.1.0/24</w:t>
+        <w:br/>
+        <w:t>═══════════════════╪══════════════════════════════</w:t>
+        <w:br/>
+        <w:t xml:space="preserve">       ┌───────────┼──────────────┐</w:t>
+        <w:br/>
+        <w:t xml:space="preserve">  ROUTER-1    ROUTER-2       SWITCH-1</w:t>
+        <w:br/>
+        <w:t xml:space="preserve">  10.0.1.1    10.0.1.2       10.0.1.10</w:t>
+        <w:br/>
+        <w:t xml:space="preserve">  IOS-XE      NX-OS          IOS  VLANs</w:t>
         <w:br/>
         <w:br/>
-        <w:t xml:space="preserve">  ── MANAGEMENT NETWORK (10.0.0.0/24) ─────────────────────────</w:t>
+        <w:t>═══════════════════════════════════════════════════</w:t>
         <w:br/>
-        <w:t xml:space="preserve">        ┌──────────┬──────────┬──────────┬──────────────┐</w:t>
+        <w:t xml:space="preserve">  STUDENT PODS  10.0.0.101 – 10.0.0.112  (×12)</w:t>
         <w:br/>
-        <w:t xml:space="preserve">        │          │          │          │              │</w:t>
-        <w:br/>
-        <w:t xml:space="preserve">  ┌─────┴───┐ ┌───┴─────┐ ┌──┴──────┐ ┌─┴──────┐ ┌────┴────────┐</w:t>
-        <w:br/>
-        <w:t xml:space="preserve">  │CONTROL  │ │ROUTER-2 │ │FIREWALL │ │NETBOX  │ │  NMS/API    │</w:t>
-        <w:br/>
-        <w:t xml:space="preserve">  │  NODE   │ │10.0.0.2 │ │10.0.0.254│ │:8000   │ │   :8080     │</w:t>
-        <w:br/>
-        <w:t xml:space="preserve">  │10.0.0.50│ │  NX-OS  │ │  ASA    │ │        │ │             │</w:t>
-        <w:br/>
-        <w:t xml:space="preserve">  │Git/Ans/ │ └─────────┘ └─────────┘ └────────┘ └─────────────┘</w:t>
-        <w:br/>
-        <w:t xml:space="preserve">  │  API    │</w:t>
-        <w:br/>
-        <w:t xml:space="preserve">  └─────────┘</w:t>
+        <w:t>═══════════════════════════════════════════════════</w:t>
       </w:r>
     </w:p>
     <w:p>
@@ -484,16 +590,14 @@
         <w:tblLook w:firstColumn="1" w:firstRow="1" w:lastColumn="0" w:lastRow="0" w:noHBand="0" w:noVBand="1" w:val="04A0"/>
       </w:tblPr>
       <w:tblGrid>
-        <w:gridCol w:w="1728"/>
-        <w:gridCol w:w="1728"/>
-        <w:gridCol w:w="1728"/>
-        <w:gridCol w:w="1728"/>
-        <w:gridCol w:w="1728"/>
+        <w:gridCol w:w="2880"/>
+        <w:gridCol w:w="2880"/>
+        <w:gridCol w:w="2880"/>
       </w:tblGrid>
       <w:tr>
         <w:tc>
           <w:tcPr>
-            <w:tcW w:type="dxa" w:w="2160"/>
+            <w:tcW w:type="dxa" w:w="2880"/>
             <w:shd w:val="clear" w:color="auto" w:fill="1F4E79"/>
           </w:tcPr>
           <w:p>
@@ -502,22 +606,7 @@
                 <w:b/>
                 <w:color w:val="FFFFFF"/>
               </w:rPr>
-              <w:t>Device</w:t>
-            </w:r>
-          </w:p>
-        </w:tc>
-        <w:tc>
-          <w:tcPr>
-            <w:tcW w:type="dxa" w:w="1728"/>
-            <w:shd w:val="clear" w:color="auto" w:fill="1F4E79"/>
-          </w:tcPr>
-          <w:p>
-            <w:r>
-              <w:rPr>
-                <w:b/>
-                <w:color w:val="FFFFFF"/>
-              </w:rPr>
-              <w:t>Interface</w:t>
+              <w:t>Device / Host</w:t>
             </w:r>
           </w:p>
         </w:tc>
@@ -538,22 +627,7 @@
         </w:tc>
         <w:tc>
           <w:tcPr>
-            <w:tcW w:type="dxa" w:w="1152"/>
-            <w:shd w:val="clear" w:color="auto" w:fill="1F4E79"/>
-          </w:tcPr>
-          <w:p>
-            <w:r>
-              <w:rPr>
-                <w:b/>
-                <w:color w:val="FFFFFF"/>
-              </w:rPr>
-              <w:t>Subnet</w:t>
-            </w:r>
-          </w:p>
-        </w:tc>
-        <w:tc>
-          <w:tcPr>
-            <w:tcW w:type="dxa" w:w="2880"/>
+            <w:tcW w:type="dxa" w:w="4320"/>
             <w:shd w:val="clear" w:color="auto" w:fill="1F4E79"/>
           </w:tcPr>
           <w:p>
@@ -570,281 +644,11 @@
       <w:tr>
         <w:tc>
           <w:tcPr>
-            <w:tcW w:type="dxa" w:w="2160"/>
-          </w:tcPr>
-          <w:p>
-            <w:r>
-              <w:t>Router-1</w:t>
-            </w:r>
-          </w:p>
-        </w:tc>
-        <w:tc>
-          <w:tcPr>
-            <w:tcW w:type="dxa" w:w="1728"/>
-          </w:tcPr>
-          <w:p>
-            <w:r>
-              <w:t>Gi0/0</w:t>
-            </w:r>
-          </w:p>
-        </w:tc>
-        <w:tc>
-          <w:tcPr>
-            <w:tcW w:type="dxa" w:w="2160"/>
-          </w:tcPr>
-          <w:p>
-            <w:r>
-              <w:t>203.0.113.1</w:t>
-            </w:r>
-          </w:p>
-        </w:tc>
-        <w:tc>
-          <w:tcPr>
-            <w:tcW w:type="dxa" w:w="1152"/>
-          </w:tcPr>
-          <w:p>
-            <w:r>
-              <w:t>/30</w:t>
-            </w:r>
-          </w:p>
-        </w:tc>
-        <w:tc>
-          <w:tcPr>
             <w:tcW w:type="dxa" w:w="2880"/>
           </w:tcPr>
           <w:p>
             <w:r>
-              <w:t>WAN Uplink</w:t>
-            </w:r>
-          </w:p>
-        </w:tc>
-      </w:tr>
-      <w:tr>
-        <w:tc>
-          <w:tcPr>
-            <w:tcW w:type="dxa" w:w="2160"/>
-          </w:tcPr>
-          <w:p>
-            <w:r>
-              <w:t>Router-1</w:t>
-            </w:r>
-          </w:p>
-        </w:tc>
-        <w:tc>
-          <w:tcPr>
-            <w:tcW w:type="dxa" w:w="1728"/>
-          </w:tcPr>
-          <w:p>
-            <w:r>
-              <w:t>Gi0/1</w:t>
-            </w:r>
-          </w:p>
-        </w:tc>
-        <w:tc>
-          <w:tcPr>
-            <w:tcW w:type="dxa" w:w="2160"/>
-          </w:tcPr>
-          <w:p>
-            <w:r>
-              <w:t>10.0.0.1</w:t>
-            </w:r>
-          </w:p>
-        </w:tc>
-        <w:tc>
-          <w:tcPr>
-            <w:tcW w:type="dxa" w:w="1152"/>
-          </w:tcPr>
-          <w:p>
-            <w:r>
-              <w:t>/24</w:t>
-            </w:r>
-          </w:p>
-        </w:tc>
-        <w:tc>
-          <w:tcPr>
-            <w:tcW w:type="dxa" w:w="2880"/>
-          </w:tcPr>
-          <w:p>
-            <w:r>
-              <w:t>LAN Gateway</w:t>
-            </w:r>
-          </w:p>
-        </w:tc>
-      </w:tr>
-      <w:tr>
-        <w:tc>
-          <w:tcPr>
-            <w:tcW w:type="dxa" w:w="2160"/>
-          </w:tcPr>
-          <w:p>
-            <w:r>
-              <w:t>Router-2</w:t>
-            </w:r>
-          </w:p>
-        </w:tc>
-        <w:tc>
-          <w:tcPr>
-            <w:tcW w:type="dxa" w:w="1728"/>
-          </w:tcPr>
-          <w:p>
-            <w:r>
-              <w:t>Gi0/0</w:t>
-            </w:r>
-          </w:p>
-        </w:tc>
-        <w:tc>
-          <w:tcPr>
-            <w:tcW w:type="dxa" w:w="2160"/>
-          </w:tcPr>
-          <w:p>
-            <w:r>
-              <w:t>10.0.0.2</w:t>
-            </w:r>
-          </w:p>
-        </w:tc>
-        <w:tc>
-          <w:tcPr>
-            <w:tcW w:type="dxa" w:w="1152"/>
-          </w:tcPr>
-          <w:p>
-            <w:r>
-              <w:t>/24</w:t>
-            </w:r>
-          </w:p>
-        </w:tc>
-        <w:tc>
-          <w:tcPr>
-            <w:tcW w:type="dxa" w:w="2880"/>
-          </w:tcPr>
-          <w:p>
-            <w:r>
-              <w:t>Secondary Router</w:t>
-            </w:r>
-          </w:p>
-        </w:tc>
-      </w:tr>
-      <w:tr>
-        <w:tc>
-          <w:tcPr>
-            <w:tcW w:type="dxa" w:w="2160"/>
-          </w:tcPr>
-          <w:p>
-            <w:r>
-              <w:t>Switch-1</w:t>
-            </w:r>
-          </w:p>
-        </w:tc>
-        <w:tc>
-          <w:tcPr>
-            <w:tcW w:type="dxa" w:w="1728"/>
-          </w:tcPr>
-          <w:p>
-            <w:r>
-              <w:t>Vlan99</w:t>
-            </w:r>
-          </w:p>
-        </w:tc>
-        <w:tc>
-          <w:tcPr>
-            <w:tcW w:type="dxa" w:w="2160"/>
-          </w:tcPr>
-          <w:p>
-            <w:r>
-              <w:t>10.0.0.10</w:t>
-            </w:r>
-          </w:p>
-        </w:tc>
-        <w:tc>
-          <w:tcPr>
-            <w:tcW w:type="dxa" w:w="1152"/>
-          </w:tcPr>
-          <w:p>
-            <w:r>
-              <w:t>/24</w:t>
-            </w:r>
-          </w:p>
-        </w:tc>
-        <w:tc>
-          <w:tcPr>
-            <w:tcW w:type="dxa" w:w="2880"/>
-          </w:tcPr>
-          <w:p>
-            <w:r>
-              <w:t>Management</w:t>
-            </w:r>
-          </w:p>
-        </w:tc>
-      </w:tr>
-      <w:tr>
-        <w:tc>
-          <w:tcPr>
-            <w:tcW w:type="dxa" w:w="2160"/>
-          </w:tcPr>
-          <w:p>
-            <w:r>
-              <w:t>Firewall-1</w:t>
-            </w:r>
-          </w:p>
-        </w:tc>
-        <w:tc>
-          <w:tcPr>
-            <w:tcW w:type="dxa" w:w="1728"/>
-          </w:tcPr>
-          <w:p>
-            <w:r>
-              <w:t>Mgmt</w:t>
-            </w:r>
-          </w:p>
-        </w:tc>
-        <w:tc>
-          <w:tcPr>
-            <w:tcW w:type="dxa" w:w="2160"/>
-          </w:tcPr>
-          <w:p>
-            <w:r>
-              <w:t>10.0.0.254</w:t>
-            </w:r>
-          </w:p>
-        </w:tc>
-        <w:tc>
-          <w:tcPr>
-            <w:tcW w:type="dxa" w:w="1152"/>
-          </w:tcPr>
-          <w:p>
-            <w:r>
-              <w:t>/24</w:t>
-            </w:r>
-          </w:p>
-        </w:tc>
-        <w:tc>
-          <w:tcPr>
-            <w:tcW w:type="dxa" w:w="2880"/>
-          </w:tcPr>
-          <w:p>
-            <w:r>
-              <w:t>Default GW Backup</w:t>
-            </w:r>
-          </w:p>
-        </w:tc>
-      </w:tr>
-      <w:tr>
-        <w:tc>
-          <w:tcPr>
-            <w:tcW w:type="dxa" w:w="2160"/>
-          </w:tcPr>
-          <w:p>
-            <w:r>
               <w:t>Control Node</w:t>
-            </w:r>
-          </w:p>
-        </w:tc>
-        <w:tc>
-          <w:tcPr>
-            <w:tcW w:type="dxa" w:w="1728"/>
-          </w:tcPr>
-          <w:p>
-            <w:r>
-              <w:t>eth0</w:t>
             </w:r>
           </w:p>
         </w:tc>
@@ -860,21 +664,11 @@
         </w:tc>
         <w:tc>
           <w:tcPr>
-            <w:tcW w:type="dxa" w:w="1152"/>
+            <w:tcW w:type="dxa" w:w="4320"/>
           </w:tcPr>
           <w:p>
             <w:r>
-              <w:t>/24</w:t>
-            </w:r>
-          </w:p>
-        </w:tc>
-        <w:tc>
-          <w:tcPr>
-            <w:tcW w:type="dxa" w:w="2880"/>
-          </w:tcPr>
-          <w:p>
-            <w:r>
-              <w:t>Automation Engine</w:t>
+              <w:t>Automation engine (shared)</w:t>
             </w:r>
           </w:p>
         </w:tc>
@@ -882,21 +676,11 @@
       <w:tr>
         <w:tc>
           <w:tcPr>
-            <w:tcW w:type="dxa" w:w="2160"/>
+            <w:tcW w:type="dxa" w:w="2880"/>
           </w:tcPr>
           <w:p>
             <w:r>
               <w:t>NetBox</w:t>
-            </w:r>
-          </w:p>
-        </w:tc>
-        <w:tc>
-          <w:tcPr>
-            <w:tcW w:type="dxa" w:w="1728"/>
-          </w:tcPr>
-          <w:p>
-            <w:r>
-              <w:t>eth0</w:t>
             </w:r>
           </w:p>
         </w:tc>
@@ -912,21 +696,11 @@
         </w:tc>
         <w:tc>
           <w:tcPr>
-            <w:tcW w:type="dxa" w:w="1152"/>
+            <w:tcW w:type="dxa" w:w="4320"/>
           </w:tcPr>
           <w:p>
             <w:r>
-              <w:t>/24</w:t>
-            </w:r>
-          </w:p>
-        </w:tc>
-        <w:tc>
-          <w:tcPr>
-            <w:tcW w:type="dxa" w:w="2880"/>
-          </w:tcPr>
-          <w:p>
-            <w:r>
-              <w:t>IPAM / DCIM</w:t>
+              <w:t>IPAM / DCIM + REST API</w:t>
             </w:r>
           </w:p>
         </w:tc>
@@ -934,21 +708,11 @@
       <w:tr>
         <w:tc>
           <w:tcPr>
-            <w:tcW w:type="dxa" w:w="2160"/>
+            <w:tcW w:type="dxa" w:w="2880"/>
           </w:tcPr>
           <w:p>
             <w:r>
-              <w:t>NMS/API</w:t>
-            </w:r>
-          </w:p>
-        </w:tc>
-        <w:tc>
-          <w:tcPr>
-            <w:tcW w:type="dxa" w:w="1728"/>
-          </w:tcPr>
-          <w:p>
-            <w:r>
-              <w:t>eth0</w:t>
+              <w:t>Gitea (Git Srv)</w:t>
             </w:r>
           </w:p>
         </w:tc>
@@ -958,27 +722,485 @@
           </w:tcPr>
           <w:p>
             <w:r>
-              <w:t>10.0.0.200</w:t>
+              <w:t>10.0.0.60</w:t>
             </w:r>
           </w:p>
         </w:tc>
         <w:tc>
           <w:tcPr>
-            <w:tcW w:type="dxa" w:w="1152"/>
+            <w:tcW w:type="dxa" w:w="4320"/>
           </w:tcPr>
           <w:p>
             <w:r>
-              <w:t>/24</w:t>
+              <w:t>Repository server</w:t>
             </w:r>
           </w:p>
         </w:tc>
+      </w:tr>
+      <w:tr>
         <w:tc>
           <w:tcPr>
             <w:tcW w:type="dxa" w:w="2880"/>
           </w:tcPr>
           <w:p>
             <w:r>
-              <w:t>REST API Endpoint</w:t>
+              <w:t>Router-1</w:t>
+            </w:r>
+          </w:p>
+        </w:tc>
+        <w:tc>
+          <w:tcPr>
+            <w:tcW w:type="dxa" w:w="2160"/>
+          </w:tcPr>
+          <w:p>
+            <w:r>
+              <w:t>10.0.1.1</w:t>
+            </w:r>
+          </w:p>
+        </w:tc>
+        <w:tc>
+          <w:tcPr>
+            <w:tcW w:type="dxa" w:w="4320"/>
+          </w:tcPr>
+          <w:p>
+            <w:r>
+              <w:t>IOS-XE lab router + RESTCONF</w:t>
+            </w:r>
+          </w:p>
+        </w:tc>
+      </w:tr>
+      <w:tr>
+        <w:tc>
+          <w:tcPr>
+            <w:tcW w:type="dxa" w:w="2880"/>
+          </w:tcPr>
+          <w:p>
+            <w:r>
+              <w:t>Router-2</w:t>
+            </w:r>
+          </w:p>
+        </w:tc>
+        <w:tc>
+          <w:tcPr>
+            <w:tcW w:type="dxa" w:w="2160"/>
+          </w:tcPr>
+          <w:p>
+            <w:r>
+              <w:t>10.0.1.2</w:t>
+            </w:r>
+          </w:p>
+        </w:tc>
+        <w:tc>
+          <w:tcPr>
+            <w:tcW w:type="dxa" w:w="4320"/>
+          </w:tcPr>
+          <w:p>
+            <w:r>
+              <w:t>NX-OS secondary router</w:t>
+            </w:r>
+          </w:p>
+        </w:tc>
+      </w:tr>
+      <w:tr>
+        <w:tc>
+          <w:tcPr>
+            <w:tcW w:type="dxa" w:w="2880"/>
+          </w:tcPr>
+          <w:p>
+            <w:r>
+              <w:t>Switch-1</w:t>
+            </w:r>
+          </w:p>
+        </w:tc>
+        <w:tc>
+          <w:tcPr>
+            <w:tcW w:type="dxa" w:w="2160"/>
+          </w:tcPr>
+          <w:p>
+            <w:r>
+              <w:t>10.0.1.10</w:t>
+            </w:r>
+          </w:p>
+        </w:tc>
+        <w:tc>
+          <w:tcPr>
+            <w:tcW w:type="dxa" w:w="4320"/>
+          </w:tcPr>
+          <w:p>
+            <w:r>
+              <w:t>IOS access switch + VLANs</w:t>
+            </w:r>
+          </w:p>
+        </w:tc>
+      </w:tr>
+      <w:tr>
+        <w:tc>
+          <w:tcPr>
+            <w:tcW w:type="dxa" w:w="2880"/>
+          </w:tcPr>
+          <w:p>
+            <w:r>
+              <w:t>Student Pod 01–12</w:t>
+            </w:r>
+          </w:p>
+        </w:tc>
+        <w:tc>
+          <w:tcPr>
+            <w:tcW w:type="dxa" w:w="2160"/>
+          </w:tcPr>
+          <w:p>
+            <w:r>
+              <w:t>10.0.0.101–112</w:t>
+            </w:r>
+          </w:p>
+        </w:tc>
+        <w:tc>
+          <w:tcPr>
+            <w:tcW w:type="dxa" w:w="4320"/>
+          </w:tcPr>
+          <w:p>
+            <w:r>
+              <w:t>Student workstations</w:t>
+            </w:r>
+          </w:p>
+        </w:tc>
+      </w:tr>
+    </w:tbl>
+    <w:p/>
+    <w:p>
+      <w:pPr>
+        <w:pStyle w:val="Heading2"/>
+      </w:pPr>
+      <w:r>
+        <w:rPr>
+          <w:color w:val="2E74B5"/>
+        </w:rPr>
+        <w:t>2.2 Free Public API Reference</w:t>
+      </w:r>
+    </w:p>
+    <w:tbl>
+      <w:tblPr>
+        <w:tblStyle w:val="TableGrid"/>
+        <w:tblW w:type="auto" w:w="0"/>
+        <w:jc w:val="left"/>
+        <w:tblLook w:firstColumn="1" w:firstRow="1" w:lastColumn="0" w:lastRow="0" w:noHBand="0" w:noVBand="1" w:val="04A0"/>
+      </w:tblPr>
+      <w:tblGrid>
+        <w:gridCol w:w="2160"/>
+        <w:gridCol w:w="2160"/>
+        <w:gridCol w:w="2160"/>
+        <w:gridCol w:w="2160"/>
+      </w:tblGrid>
+      <w:tr>
+        <w:tc>
+          <w:tcPr>
+            <w:tcW w:type="dxa" w:w="2592"/>
+            <w:shd w:val="clear" w:color="auto" w:fill="1F4E79"/>
+          </w:tcPr>
+          <w:p>
+            <w:r>
+              <w:rPr>
+                <w:b/>
+                <w:color w:val="FFFFFF"/>
+              </w:rPr>
+              <w:t>Service</w:t>
+            </w:r>
+          </w:p>
+        </w:tc>
+        <w:tc>
+          <w:tcPr>
+            <w:tcW w:type="dxa" w:w="2592"/>
+            <w:shd w:val="clear" w:color="auto" w:fill="1F4E79"/>
+          </w:tcPr>
+          <w:p>
+            <w:r>
+              <w:rPr>
+                <w:b/>
+                <w:color w:val="FFFFFF"/>
+              </w:rPr>
+              <w:t>Base URL</w:t>
+            </w:r>
+          </w:p>
+        </w:tc>
+        <w:tc>
+          <w:tcPr>
+            <w:tcW w:type="dxa" w:w="2016"/>
+            <w:shd w:val="clear" w:color="auto" w:fill="1F4E79"/>
+          </w:tcPr>
+          <w:p>
+            <w:r>
+              <w:rPr>
+                <w:b/>
+                <w:color w:val="FFFFFF"/>
+              </w:rPr>
+              <w:t>Auth</w:t>
+            </w:r>
+          </w:p>
+        </w:tc>
+        <w:tc>
+          <w:tcPr>
+            <w:tcW w:type="dxa" w:w="2160"/>
+            <w:shd w:val="clear" w:color="auto" w:fill="1F4E79"/>
+          </w:tcPr>
+          <w:p>
+            <w:r>
+              <w:rPr>
+                <w:b/>
+                <w:color w:val="FFFFFF"/>
+              </w:rPr>
+              <w:t>Best For</w:t>
+            </w:r>
+          </w:p>
+        </w:tc>
+      </w:tr>
+      <w:tr>
+        <w:tc>
+          <w:tcPr>
+            <w:tcW w:type="dxa" w:w="2592"/>
+          </w:tcPr>
+          <w:p>
+            <w:r>
+              <w:t>Cisco DevNet IOS-XE</w:t>
+            </w:r>
+          </w:p>
+        </w:tc>
+        <w:tc>
+          <w:tcPr>
+            <w:tcW w:type="dxa" w:w="2592"/>
+          </w:tcPr>
+          <w:p>
+            <w:r>
+              <w:t>sandbox-iosxe-latest-1.cisco.com</w:t>
+            </w:r>
+          </w:p>
+        </w:tc>
+        <w:tc>
+          <w:tcPr>
+            <w:tcW w:type="dxa" w:w="2016"/>
+          </w:tcPr>
+          <w:p>
+            <w:r>
+              <w:t>devnetuser/Cisco123!</w:t>
+            </w:r>
+          </w:p>
+        </w:tc>
+        <w:tc>
+          <w:tcPr>
+            <w:tcW w:type="dxa" w:w="2160"/>
+          </w:tcPr>
+          <w:p>
+            <w:r>
+              <w:t>RESTCONF on real IOS-XE</w:t>
+            </w:r>
+          </w:p>
+        </w:tc>
+      </w:tr>
+      <w:tr>
+        <w:tc>
+          <w:tcPr>
+            <w:tcW w:type="dxa" w:w="2592"/>
+          </w:tcPr>
+          <w:p>
+            <w:r>
+              <w:t>NetBox Demo</w:t>
+            </w:r>
+          </w:p>
+        </w:tc>
+        <w:tc>
+          <w:tcPr>
+            <w:tcW w:type="dxa" w:w="2592"/>
+          </w:tcPr>
+          <w:p>
+            <w:r>
+              <w:t>demo.netbox.dev/api/</w:t>
+            </w:r>
+          </w:p>
+        </w:tc>
+        <w:tc>
+          <w:tcPr>
+            <w:tcW w:type="dxa" w:w="2016"/>
+          </w:tcPr>
+          <w:p>
+            <w:r>
+              <w:t>Public demo token</w:t>
+            </w:r>
+          </w:p>
+        </w:tc>
+        <w:tc>
+          <w:tcPr>
+            <w:tcW w:type="dxa" w:w="2160"/>
+          </w:tcPr>
+          <w:p>
+            <w:r>
+              <w:t>IPAM API queries</w:t>
+            </w:r>
+          </w:p>
+        </w:tc>
+      </w:tr>
+      <w:tr>
+        <w:tc>
+          <w:tcPr>
+            <w:tcW w:type="dxa" w:w="2592"/>
+          </w:tcPr>
+          <w:p>
+            <w:r>
+              <w:t>BGPView</w:t>
+            </w:r>
+          </w:p>
+        </w:tc>
+        <w:tc>
+          <w:tcPr>
+            <w:tcW w:type="dxa" w:w="2592"/>
+          </w:tcPr>
+          <w:p>
+            <w:r>
+              <w:t>api.bgpview.io</w:t>
+            </w:r>
+          </w:p>
+        </w:tc>
+        <w:tc>
+          <w:tcPr>
+            <w:tcW w:type="dxa" w:w="2016"/>
+          </w:tcPr>
+          <w:p>
+            <w:r>
+              <w:t>None</w:t>
+            </w:r>
+          </w:p>
+        </w:tc>
+        <w:tc>
+          <w:tcPr>
+            <w:tcW w:type="dxa" w:w="2160"/>
+          </w:tcPr>
+          <w:p>
+            <w:r>
+              <w:t>ASN, prefix, BGP data</w:t>
+            </w:r>
+          </w:p>
+        </w:tc>
+      </w:tr>
+      <w:tr>
+        <w:tc>
+          <w:tcPr>
+            <w:tcW w:type="dxa" w:w="2592"/>
+          </w:tcPr>
+          <w:p>
+            <w:r>
+              <w:t>PeeringDB</w:t>
+            </w:r>
+          </w:p>
+        </w:tc>
+        <w:tc>
+          <w:tcPr>
+            <w:tcW w:type="dxa" w:w="2592"/>
+          </w:tcPr>
+          <w:p>
+            <w:r>
+              <w:t>peeringdb.com/api/</w:t>
+            </w:r>
+          </w:p>
+        </w:tc>
+        <w:tc>
+          <w:tcPr>
+            <w:tcW w:type="dxa" w:w="2016"/>
+          </w:tcPr>
+          <w:p>
+            <w:r>
+              <w:t>None (read)</w:t>
+            </w:r>
+          </w:p>
+        </w:tc>
+        <w:tc>
+          <w:tcPr>
+            <w:tcW w:type="dxa" w:w="2160"/>
+          </w:tcPr>
+          <w:p>
+            <w:r>
+              <w:t>IX and peering records</w:t>
+            </w:r>
+          </w:p>
+        </w:tc>
+      </w:tr>
+      <w:tr>
+        <w:tc>
+          <w:tcPr>
+            <w:tcW w:type="dxa" w:w="2592"/>
+          </w:tcPr>
+          <w:p>
+            <w:r>
+              <w:t>ipinfo.io</w:t>
+            </w:r>
+          </w:p>
+        </w:tc>
+        <w:tc>
+          <w:tcPr>
+            <w:tcW w:type="dxa" w:w="2592"/>
+          </w:tcPr>
+          <w:p>
+            <w:r>
+              <w:t>ipinfo.io</w:t>
+            </w:r>
+          </w:p>
+        </w:tc>
+        <w:tc>
+          <w:tcPr>
+            <w:tcW w:type="dxa" w:w="2016"/>
+          </w:tcPr>
+          <w:p>
+            <w:r>
+              <w:t>None (50 k/mo)</w:t>
+            </w:r>
+          </w:p>
+        </w:tc>
+        <w:tc>
+          <w:tcPr>
+            <w:tcW w:type="dxa" w:w="2160"/>
+          </w:tcPr>
+          <w:p>
+            <w:r>
+              <w:t>IP geolocation &amp; ASN</w:t>
+            </w:r>
+          </w:p>
+        </w:tc>
+      </w:tr>
+      <w:tr>
+        <w:tc>
+          <w:tcPr>
+            <w:tcW w:type="dxa" w:w="2592"/>
+          </w:tcPr>
+          <w:p>
+            <w:r>
+              <w:t>httpbin.org</w:t>
+            </w:r>
+          </w:p>
+        </w:tc>
+        <w:tc>
+          <w:tcPr>
+            <w:tcW w:type="dxa" w:w="2592"/>
+          </w:tcPr>
+          <w:p>
+            <w:r>
+              <w:t>httpbin.org</w:t>
+            </w:r>
+          </w:p>
+        </w:tc>
+        <w:tc>
+          <w:tcPr>
+            <w:tcW w:type="dxa" w:w="2016"/>
+          </w:tcPr>
+          <w:p>
+            <w:r>
+              <w:t>None</w:t>
+            </w:r>
+          </w:p>
+        </w:tc>
+        <w:tc>
+          <w:tcPr>
+            <w:tcW w:type="dxa" w:w="2160"/>
+          </w:tcPr>
+          <w:p>
+            <w:r>
+              <w:t>HTTP method practice</w:t>
             </w:r>
           </w:p>
         </w:tc>
@@ -998,7 +1220,7 @@
     </w:p>
     <w:p>
       <w:r>
-        <w:t>Git gives network teams a single source of truth for device configurations. Every change is tracked, attributed, and reversible. This section introduces core Git concepts through three practical exercises.</w:t>
+        <w:t>Git is the single source of truth for all device configurations. Every change is tracked, attributed, and reversible. Students work on personal branches and submit merge requests to main, mirroring real change-management workflows.</w:t>
       </w:r>
     </w:p>
     <w:p>
@@ -1009,183 +1231,33 @@
         <w:rPr>
           <w:color w:val="2E74B5"/>
         </w:rPr>
-        <w:t>3.1 Why Git?</w:t>
-      </w:r>
-    </w:p>
-    <w:tbl>
-      <w:tblPr>
-        <w:tblStyle w:val="TableGrid"/>
-        <w:tblW w:type="auto" w:w="0"/>
-        <w:jc w:val="left"/>
-        <w:tblLook w:firstColumn="1" w:firstRow="1" w:lastColumn="0" w:lastRow="0" w:noHBand="0" w:noVBand="1" w:val="04A0"/>
-      </w:tblPr>
-      <w:tblGrid>
-        <w:gridCol w:w="4320"/>
-        <w:gridCol w:w="4320"/>
-      </w:tblGrid>
-      <w:tr>
-        <w:tc>
-          <w:tcPr>
-            <w:tcW w:type="dxa" w:w="4608"/>
-            <w:shd w:val="clear" w:color="auto" w:fill="1F4E79"/>
-          </w:tcPr>
-          <w:p>
-            <w:r>
-              <w:rPr>
-                <w:b/>
-                <w:color w:val="FFFFFF"/>
-              </w:rPr>
-              <w:t>Traditional Approach</w:t>
-            </w:r>
-          </w:p>
-        </w:tc>
-        <w:tc>
-          <w:tcPr>
-            <w:tcW w:type="dxa" w:w="4608"/>
-            <w:shd w:val="clear" w:color="auto" w:fill="1F4E79"/>
-          </w:tcPr>
-          <w:p>
-            <w:r>
-              <w:rPr>
-                <w:b/>
-                <w:color w:val="FFFFFF"/>
-              </w:rPr>
-              <w:t>Git-Based Approach</w:t>
-            </w:r>
-          </w:p>
-        </w:tc>
-      </w:tr>
-      <w:tr>
-        <w:tc>
-          <w:tcPr>
-            <w:tcW w:type="dxa" w:w="4608"/>
-          </w:tcPr>
-          <w:p>
-            <w:r>
-              <w:t>Configs saved on one engineer's laptop</w:t>
-            </w:r>
-          </w:p>
-        </w:tc>
-        <w:tc>
-          <w:tcPr>
-            <w:tcW w:type="dxa" w:w="4608"/>
-          </w:tcPr>
-          <w:p>
-            <w:r>
-              <w:t>Shared repository with central backup</w:t>
-            </w:r>
-          </w:p>
-        </w:tc>
-      </w:tr>
-      <w:tr>
-        <w:tc>
-          <w:tcPr>
-            <w:tcW w:type="dxa" w:w="4608"/>
-          </w:tcPr>
-          <w:p>
-            <w:r>
-              <w:t>No change history</w:t>
-            </w:r>
-          </w:p>
-        </w:tc>
-        <w:tc>
-          <w:tcPr>
-            <w:tcW w:type="dxa" w:w="4608"/>
-          </w:tcPr>
-          <w:p>
-            <w:r>
-              <w:t>Full audit trail: author, date, reason</w:t>
-            </w:r>
-          </w:p>
-        </w:tc>
-      </w:tr>
-      <w:tr>
-        <w:tc>
-          <w:tcPr>
-            <w:tcW w:type="dxa" w:w="4608"/>
-          </w:tcPr>
-          <w:p>
-            <w:r>
-              <w:t>Rollback = manual copy-paste</w:t>
-            </w:r>
-          </w:p>
-        </w:tc>
-        <w:tc>
-          <w:tcPr>
-            <w:tcW w:type="dxa" w:w="4608"/>
-          </w:tcPr>
-          <w:p>
-            <w:r>
-              <w:t>git revert restores instantly</w:t>
-            </w:r>
-          </w:p>
-        </w:tc>
-      </w:tr>
-      <w:tr>
-        <w:tc>
-          <w:tcPr>
-            <w:tcW w:type="dxa" w:w="4608"/>
-          </w:tcPr>
-          <w:p>
-            <w:r>
-              <w:t>No review process</w:t>
-            </w:r>
-          </w:p>
-        </w:tc>
-        <w:tc>
-          <w:tcPr>
-            <w:tcW w:type="dxa" w:w="4608"/>
-          </w:tcPr>
-          <w:p>
-            <w:r>
-              <w:t>Pull Requests enforce peer review</w:t>
-            </w:r>
-          </w:p>
-        </w:tc>
-      </w:tr>
-    </w:tbl>
-    <w:p/>
-    <w:p>
-      <w:pPr>
-        <w:pStyle w:val="Heading2"/>
-      </w:pPr>
-      <w:r>
-        <w:rPr>
-          <w:color w:val="2E74B5"/>
-        </w:rPr>
-        <w:t>3.2 Exercise 1 — Initialise a Config Repository</w:t>
-      </w:r>
-    </w:p>
-    <w:p>
-      <w:r>
-        <w:t>Create a new Git repository and commit a baseline router configuration.</w:t>
+        <w:t>3.1 Exercise 1 — Initialise a Config Repository</w:t>
       </w:r>
     </w:p>
     <w:p>
       <w:pPr>
         <w:ind w:left="283"/>
-        <w:shd w:val="clear" w:color="auto" w:fill="F0F0F0"/>
+        <w:shd w:val="clear" w:color="auto" w:fill="EFEFEF"/>
       </w:pPr>
       <w:r>
         <w:rPr>
           <w:rFonts w:ascii="Courier New" w:hAnsi="Courier New"/>
-          <w:color w:val="202020"/>
+          <w:color w:val="1A1A1A"/>
           <w:sz w:val="16"/>
         </w:rPr>
         <w:t>mkdir net-configs &amp;&amp; cd net-configs</w:t>
         <w:br/>
         <w:t>git init</w:t>
         <w:br/>
-        <w:t>git config user.name  "Network Engineer"</w:t>
+        <w:t>git config user.name  'Network Engineer'</w:t>
         <w:br/>
-        <w:t>git config user.email "neteng@example.com"</w:t>
-        <w:br/>
+        <w:t>git config user.email 'neteng@example.com'</w:t>
         <w:br/>
         <w:t>cp ../configs/router1_baseline.cfg .</w:t>
         <w:br/>
         <w:t>git add router1_baseline.cfg</w:t>
         <w:br/>
-        <w:t>git commit -m "feat: add Router-1 baseline config"</w:t>
+        <w:t>git commit -m 'feat: add Router-1 baseline config'</w:t>
         <w:br/>
         <w:t>git log --oneline</w:t>
       </w:r>
@@ -1198,41 +1270,29 @@
         <w:rPr>
           <w:color w:val="2E74B5"/>
         </w:rPr>
-        <w:t>3.3 Exercise 2 — Branching for Change Management</w:t>
-      </w:r>
-    </w:p>
-    <w:p>
-      <w:r>
-        <w:t>Use a feature branch per change request, then merge after peer review.</w:t>
+        <w:t>3.2 Exercise 2 — Branching for Change Management</w:t>
       </w:r>
     </w:p>
     <w:p>
       <w:pPr>
         <w:ind w:left="283"/>
-        <w:shd w:val="clear" w:color="auto" w:fill="F0F0F0"/>
+        <w:shd w:val="clear" w:color="auto" w:fill="EFEFEF"/>
       </w:pPr>
       <w:r>
         <w:rPr>
           <w:rFonts w:ascii="Courier New" w:hAnsi="Courier New"/>
-          <w:color w:val="202020"/>
+          <w:color w:val="1A1A1A"/>
           <w:sz w:val="16"/>
         </w:rPr>
         <w:t>git checkout -b change/CR-1042-add-loopback</w:t>
         <w:br/>
+        <w:t>echo 'interface Loopback0\n ip address 10.255.255.1 255.255.255.255' &gt;&gt; router1.cfg</w:t>
         <w:br/>
-        <w:t>echo "interface Loopback0</w:t>
+        <w:t>git add router1.cfg</w:t>
         <w:br/>
-        <w:t xml:space="preserve"> ip address 10.255.255.1 255.255.255.255</w:t>
+        <w:t>git commit -m 'feat(CR-1042): add Loopback0 to Router-1'</w:t>
         <w:br/>
-        <w:t xml:space="preserve"> no shutdown" &gt;&gt; router1_baseline.cfg</w:t>
-        <w:br/>
-        <w:br/>
-        <w:t>git add router1_baseline.cfg</w:t>
-        <w:br/>
-        <w:t>git commit -m "feat(CR-1042): add Loopback0 to Router-1"</w:t>
-        <w:br/>
-        <w:br/>
-        <w:t>git diff main change/CR-1042-add-loopback   # review before merging</w:t>
+        <w:t>git diff main change/CR-1042-add-loopback</w:t>
         <w:br/>
         <w:t>git checkout main</w:t>
         <w:br/>
@@ -1247,35 +1307,27 @@
         <w:rPr>
           <w:color w:val="2E74B5"/>
         </w:rPr>
-        <w:t>3.4 Exercise 3 — Configuration Rollback</w:t>
-      </w:r>
-    </w:p>
-    <w:p>
-      <w:r>
-        <w:t>Simulate a bad commit and restore the previous good state.</w:t>
+        <w:t>3.3 Exercise 3 — Configuration Rollback</w:t>
       </w:r>
     </w:p>
     <w:p>
       <w:pPr>
         <w:ind w:left="283"/>
-        <w:shd w:val="clear" w:color="auto" w:fill="F0F0F0"/>
+        <w:shd w:val="clear" w:color="auto" w:fill="EFEFEF"/>
       </w:pPr>
       <w:r>
         <w:rPr>
           <w:rFonts w:ascii="Courier New" w:hAnsi="Courier New"/>
-          <w:color w:val="202020"/>
+          <w:color w:val="1A1A1A"/>
           <w:sz w:val="16"/>
         </w:rPr>
-        <w:t>echo "no ip routing" &gt;&gt; router1_baseline.cfg</w:t>
+        <w:t>echo 'no ip routing' &gt;&gt; router1.cfg</w:t>
         <w:br/>
-        <w:t>git add router1_baseline.cfg</w:t>
+        <w:t>git add router1.cfg &amp;&amp; git commit -m 'ERROR: removed ip routing'</w:t>
         <w:br/>
-        <w:t>git commit -m "ERROR: accidentally removed ip routing"</w:t>
+        <w:t>git log --oneline</w:t>
         <w:br/>
-        <w:br/>
-        <w:t>git log --oneline              # identify the good commit hash</w:t>
-        <w:br/>
-        <w:t>git revert HEAD                # safe: creates an undo commit</w:t>
+        <w:t>git revert HEAD          # safe: creates an undo commit</w:t>
         <w:br/>
         <w:t>git push origin main</w:t>
       </w:r>
@@ -1288,7 +1340,7 @@
         <w:rPr>
           <w:color w:val="2E74B5"/>
         </w:rPr>
-        <w:t>3.5 Key Git Commands</w:t>
+        <w:t>3.4 Key Git Commands</w:t>
       </w:r>
     </w:p>
     <w:tbl>
@@ -1517,28 +1569,6 @@
           </w:tcPr>
           <w:p>
             <w:r>
-              <w:t>git reset --hard &lt;hash&gt;</w:t>
-            </w:r>
-          </w:p>
-        </w:tc>
-        <w:tc>
-          <w:tcPr>
-            <w:tcW w:type="dxa" w:w="5040"/>
-          </w:tcPr>
-          <w:p>
-            <w:r>
-              <w:t>Discard commits (destructive)</w:t>
-            </w:r>
-          </w:p>
-        </w:tc>
-      </w:tr>
-      <w:tr>
-        <w:tc>
-          <w:tcPr>
-            <w:tcW w:type="dxa" w:w="4320"/>
-          </w:tcPr>
-          <w:p>
-            <w:r>
               <w:t>git tag v1.0</w:t>
             </w:r>
           </w:p>
@@ -1549,7 +1579,7 @@
           </w:tcPr>
           <w:p>
             <w:r>
-              <w:t>Tag a release / golden config</w:t>
+              <w:t>Tag a golden config release</w:t>
             </w:r>
           </w:p>
         </w:tc>
@@ -1569,7 +1599,7 @@
     </w:p>
     <w:p>
       <w:r>
-        <w:t>Ansible is an agentless automation engine that connects to devices over SSH or NETCONF and applies declarative YAML playbooks. This section covers inventory setup, three production-quality playbooks, and Jinja2 templating.</w:t>
+        <w:t>Ansible connects to the lab routers and switch over SSH and applies declarative YAML playbooks. Students always run with --check --diff before applying, mirroring the peer-review gate used in production.</w:t>
       </w:r>
     </w:p>
     <w:p>
@@ -1580,40 +1610,244 @@
         <w:rPr>
           <w:color w:val="2E74B5"/>
         </w:rPr>
-        <w:t>4.1 Inventory File</w:t>
+        <w:t>4.1 Lab Devices</w:t>
       </w:r>
     </w:p>
+    <w:tbl>
+      <w:tblPr>
+        <w:tblStyle w:val="TableGrid"/>
+        <w:tblW w:type="auto" w:w="0"/>
+        <w:jc w:val="left"/>
+        <w:tblLook w:firstColumn="1" w:firstRow="1" w:lastColumn="0" w:lastRow="0" w:noHBand="0" w:noVBand="1" w:val="04A0"/>
+      </w:tblPr>
+      <w:tblGrid>
+        <w:gridCol w:w="2160"/>
+        <w:gridCol w:w="2160"/>
+        <w:gridCol w:w="2160"/>
+        <w:gridCol w:w="2160"/>
+      </w:tblGrid>
+      <w:tr>
+        <w:tc>
+          <w:tcPr>
+            <w:tcW w:type="dxa" w:w="1728"/>
+            <w:shd w:val="clear" w:color="auto" w:fill="1F4E79"/>
+          </w:tcPr>
+          <w:p>
+            <w:r>
+              <w:rPr>
+                <w:b/>
+                <w:color w:val="FFFFFF"/>
+              </w:rPr>
+              <w:t>Host</w:t>
+            </w:r>
+          </w:p>
+        </w:tc>
+        <w:tc>
+          <w:tcPr>
+            <w:tcW w:type="dxa" w:w="1728"/>
+            <w:shd w:val="clear" w:color="auto" w:fill="1F4E79"/>
+          </w:tcPr>
+          <w:p>
+            <w:r>
+              <w:rPr>
+                <w:b/>
+                <w:color w:val="FFFFFF"/>
+              </w:rPr>
+              <w:t>IP</w:t>
+            </w:r>
+          </w:p>
+        </w:tc>
+        <w:tc>
+          <w:tcPr>
+            <w:tcW w:type="dxa" w:w="1440"/>
+            <w:shd w:val="clear" w:color="auto" w:fill="1F4E79"/>
+          </w:tcPr>
+          <w:p>
+            <w:r>
+              <w:rPr>
+                <w:b/>
+                <w:color w:val="FFFFFF"/>
+              </w:rPr>
+              <w:t>OS</w:t>
+            </w:r>
+          </w:p>
+        </w:tc>
+        <w:tc>
+          <w:tcPr>
+            <w:tcW w:type="dxa" w:w="4320"/>
+            <w:shd w:val="clear" w:color="auto" w:fill="1F4E79"/>
+          </w:tcPr>
+          <w:p>
+            <w:r>
+              <w:rPr>
+                <w:b/>
+                <w:color w:val="FFFFFF"/>
+              </w:rPr>
+              <w:t>Role</w:t>
+            </w:r>
+          </w:p>
+        </w:tc>
+      </w:tr>
+      <w:tr>
+        <w:tc>
+          <w:tcPr>
+            <w:tcW w:type="dxa" w:w="1728"/>
+          </w:tcPr>
+          <w:p>
+            <w:r>
+              <w:t>router1</w:t>
+            </w:r>
+          </w:p>
+        </w:tc>
+        <w:tc>
+          <w:tcPr>
+            <w:tcW w:type="dxa" w:w="1728"/>
+          </w:tcPr>
+          <w:p>
+            <w:r>
+              <w:t>10.0.1.1</w:t>
+            </w:r>
+          </w:p>
+        </w:tc>
+        <w:tc>
+          <w:tcPr>
+            <w:tcW w:type="dxa" w:w="1440"/>
+          </w:tcPr>
+          <w:p>
+            <w:r>
+              <w:t>IOS-XE</w:t>
+            </w:r>
+          </w:p>
+        </w:tc>
+        <w:tc>
+          <w:tcPr>
+            <w:tcW w:type="dxa" w:w="4320"/>
+          </w:tcPr>
+          <w:p>
+            <w:r>
+              <w:t>Core router / OSPF / RESTCONF</w:t>
+            </w:r>
+          </w:p>
+        </w:tc>
+      </w:tr>
+      <w:tr>
+        <w:tc>
+          <w:tcPr>
+            <w:tcW w:type="dxa" w:w="1728"/>
+          </w:tcPr>
+          <w:p>
+            <w:r>
+              <w:t>router2</w:t>
+            </w:r>
+          </w:p>
+        </w:tc>
+        <w:tc>
+          <w:tcPr>
+            <w:tcW w:type="dxa" w:w="1728"/>
+          </w:tcPr>
+          <w:p>
+            <w:r>
+              <w:t>10.0.1.2</w:t>
+            </w:r>
+          </w:p>
+        </w:tc>
+        <w:tc>
+          <w:tcPr>
+            <w:tcW w:type="dxa" w:w="1440"/>
+          </w:tcPr>
+          <w:p>
+            <w:r>
+              <w:t>NX-OS</w:t>
+            </w:r>
+          </w:p>
+        </w:tc>
+        <w:tc>
+          <w:tcPr>
+            <w:tcW w:type="dxa" w:w="4320"/>
+          </w:tcPr>
+          <w:p>
+            <w:r>
+              <w:t>Secondary router</w:t>
+            </w:r>
+          </w:p>
+        </w:tc>
+      </w:tr>
+      <w:tr>
+        <w:tc>
+          <w:tcPr>
+            <w:tcW w:type="dxa" w:w="1728"/>
+          </w:tcPr>
+          <w:p>
+            <w:r>
+              <w:t>switch1</w:t>
+            </w:r>
+          </w:p>
+        </w:tc>
+        <w:tc>
+          <w:tcPr>
+            <w:tcW w:type="dxa" w:w="1728"/>
+          </w:tcPr>
+          <w:p>
+            <w:r>
+              <w:t>10.0.1.10</w:t>
+            </w:r>
+          </w:p>
+        </w:tc>
+        <w:tc>
+          <w:tcPr>
+            <w:tcW w:type="dxa" w:w="1440"/>
+          </w:tcPr>
+          <w:p>
+            <w:r>
+              <w:t>IOS</w:t>
+            </w:r>
+          </w:p>
+        </w:tc>
+        <w:tc>
+          <w:tcPr>
+            <w:tcW w:type="dxa" w:w="4320"/>
+          </w:tcPr>
+          <w:p>
+            <w:r>
+              <w:t>Access switch / VLANs</w:t>
+            </w:r>
+          </w:p>
+        </w:tc>
+      </w:tr>
+    </w:tbl>
+    <w:p/>
     <w:p>
+      <w:pPr>
+        <w:pStyle w:val="Heading2"/>
+      </w:pPr>
       <w:r>
-        <w:t>Group devices by role in inventory/hosts.ini:</w:t>
+        <w:rPr>
+          <w:color w:val="2E74B5"/>
+        </w:rPr>
+        <w:t>4.2 Inventory File (hosts.ini)</w:t>
       </w:r>
     </w:p>
     <w:p>
       <w:pPr>
         <w:ind w:left="283"/>
-        <w:shd w:val="clear" w:color="auto" w:fill="F0F0F0"/>
+        <w:shd w:val="clear" w:color="auto" w:fill="EFEFEF"/>
       </w:pPr>
       <w:r>
         <w:rPr>
           <w:rFonts w:ascii="Courier New" w:hAnsi="Courier New"/>
-          <w:color w:val="202020"/>
+          <w:color w:val="1A1A1A"/>
           <w:sz w:val="16"/>
         </w:rPr>
         <w:t>[routers]</w:t>
         <w:br/>
-        <w:t>router1 ansible_host=10.0.0.1</w:t>
+        <w:t>router1 ansible_host=10.0.1.1</w:t>
         <w:br/>
-        <w:t>router2 ansible_host=10.0.0.2</w:t>
+        <w:t>router2 ansible_host=10.0.1.2</w:t>
         <w:br/>
         <w:br/>
         <w:t>[switches]</w:t>
         <w:br/>
-        <w:t>switch1 ansible_host=10.0.0.10</w:t>
-        <w:br/>
-        <w:br/>
-        <w:t>[firewalls]</w:t>
-        <w:br/>
-        <w:t>fw1     ansible_host=10.0.0.254</w:t>
+        <w:t>switch1 ansible_host=10.0.1.10</w:t>
         <w:br/>
         <w:br/>
         <w:t>[network:children]</w:t>
@@ -1621,8 +1855,6 @@
         <w:t>routers</w:t>
         <w:br/>
         <w:t>switches</w:t>
-        <w:br/>
-        <w:t>firewalls</w:t>
         <w:br/>
         <w:br/>
         <w:t>[network:vars]</w:t>
@@ -1644,23 +1876,18 @@
         <w:rPr>
           <w:color w:val="2E74B5"/>
         </w:rPr>
-        <w:t>4.2 Playbook 1 — Gather Facts</w:t>
-      </w:r>
-    </w:p>
-    <w:p>
-      <w:r>
-        <w:t>Connects to all devices, collects OS version, serial number, and interface list, then saves output to ./facts/ directory.</w:t>
+        <w:t>4.3 Playbook 1 — Gather Facts</w:t>
       </w:r>
     </w:p>
     <w:p>
       <w:pPr>
         <w:ind w:left="283"/>
-        <w:shd w:val="clear" w:color="auto" w:fill="F0F0F0"/>
+        <w:shd w:val="clear" w:color="auto" w:fill="EFEFEF"/>
       </w:pPr>
       <w:r>
         <w:rPr>
           <w:rFonts w:ascii="Courier New" w:hAnsi="Courier New"/>
-          <w:color w:val="202020"/>
+          <w:color w:val="1A1A1A"/>
           <w:sz w:val="16"/>
         </w:rPr>
         <w:t>ansible-playbook -i inventory/hosts.ini playbooks/01-gather-facts.yml</w:t>
@@ -1674,31 +1901,21 @@
         <w:rPr>
           <w:color w:val="2E74B5"/>
         </w:rPr>
-        <w:t>4.3 Playbook 2 — Push Interface Configuration</w:t>
-      </w:r>
-    </w:p>
-    <w:p>
-      <w:r>
-        <w:t>Renders a Jinja2 template per device and pushes interface descriptions, IP addresses, and shutdown state.</w:t>
+        <w:t>4.4 Playbook 2 — Push Interface Config</w:t>
       </w:r>
     </w:p>
     <w:p>
       <w:pPr>
         <w:ind w:left="283"/>
-        <w:shd w:val="clear" w:color="auto" w:fill="F0F0F0"/>
+        <w:shd w:val="clear" w:color="auto" w:fill="EFEFEF"/>
       </w:pPr>
       <w:r>
         <w:rPr>
           <w:rFonts w:ascii="Courier New" w:hAnsi="Courier New"/>
-          <w:color w:val="202020"/>
+          <w:color w:val="1A1A1A"/>
           <w:sz w:val="16"/>
         </w:rPr>
-        <w:t># Dry run first</w:t>
-        <w:br/>
         <w:t>ansible-playbook -i inventory/hosts.ini playbooks/02-push-config.yml --check --diff</w:t>
-        <w:br/>
-        <w:br/>
-        <w:t># Apply</w:t>
         <w:br/>
         <w:t>ansible-playbook -i inventory/hosts.ini playbooks/02-push-config.yml</w:t>
       </w:r>
@@ -1711,23 +1928,18 @@
         <w:rPr>
           <w:color w:val="2E74B5"/>
         </w:rPr>
-        <w:t>4.4 Playbook 3 — Compliance Check</w:t>
-      </w:r>
-    </w:p>
-    <w:p>
-      <w:r>
-        <w:t>Verifies SSH v2, NTP, and IP routing are configured correctly across all devices and generates a per-device compliance report.</w:t>
+        <w:t>4.5 Playbook 3 — Compliance Check</w:t>
       </w:r>
     </w:p>
     <w:p>
       <w:pPr>
         <w:ind w:left="283"/>
-        <w:shd w:val="clear" w:color="auto" w:fill="F0F0F0"/>
+        <w:shd w:val="clear" w:color="auto" w:fill="EFEFEF"/>
       </w:pPr>
       <w:r>
         <w:rPr>
           <w:rFonts w:ascii="Courier New" w:hAnsi="Courier New"/>
-          <w:color w:val="202020"/>
+          <w:color w:val="1A1A1A"/>
           <w:sz w:val="16"/>
         </w:rPr>
         <w:t>ansible-playbook -i inventory/hosts.ini playbooks/03-compliance-check.yml</w:t>
@@ -1741,18 +1953,18 @@
         <w:rPr>
           <w:color w:val="2E74B5"/>
         </w:rPr>
-        <w:t>4.5 Jinja2 Template Example</w:t>
+        <w:t>4.6 Jinja2 Template Snippet</w:t>
       </w:r>
     </w:p>
     <w:p>
       <w:pPr>
         <w:ind w:left="283"/>
-        <w:shd w:val="clear" w:color="auto" w:fill="F0F0F0"/>
+        <w:shd w:val="clear" w:color="auto" w:fill="EFEFEF"/>
       </w:pPr>
       <w:r>
         <w:rPr>
           <w:rFonts w:ascii="Courier New" w:hAnsi="Courier New"/>
-          <w:color w:val="202020"/>
+          <w:color w:val="1A1A1A"/>
           <w:sz w:val="16"/>
         </w:rPr>
         <w:t>{% for iface in interfaces %}</w:t>
@@ -1776,194 +1988,6 @@
     </w:p>
     <w:p>
       <w:pPr>
-        <w:pStyle w:val="Heading2"/>
-      </w:pPr>
-      <w:r>
-        <w:rPr>
-          <w:color w:val="2E74B5"/>
-        </w:rPr>
-        <w:t>4.6 Key Ansible Modules</w:t>
-      </w:r>
-    </w:p>
-    <w:tbl>
-      <w:tblPr>
-        <w:tblStyle w:val="TableGrid"/>
-        <w:tblW w:type="auto" w:w="0"/>
-        <w:jc w:val="left"/>
-        <w:tblLook w:firstColumn="1" w:firstRow="1" w:lastColumn="0" w:lastRow="0" w:noHBand="0" w:noVBand="1" w:val="04A0"/>
-      </w:tblPr>
-      <w:tblGrid>
-        <w:gridCol w:w="4320"/>
-        <w:gridCol w:w="4320"/>
-      </w:tblGrid>
-      <w:tr>
-        <w:tc>
-          <w:tcPr>
-            <w:tcW w:type="dxa" w:w="4320"/>
-            <w:shd w:val="clear" w:color="auto" w:fill="1F4E79"/>
-          </w:tcPr>
-          <w:p>
-            <w:r>
-              <w:rPr>
-                <w:b/>
-                <w:color w:val="FFFFFF"/>
-              </w:rPr>
-              <w:t>Module</w:t>
-            </w:r>
-          </w:p>
-        </w:tc>
-        <w:tc>
-          <w:tcPr>
-            <w:tcW w:type="dxa" w:w="5040"/>
-            <w:shd w:val="clear" w:color="auto" w:fill="1F4E79"/>
-          </w:tcPr>
-          <w:p>
-            <w:r>
-              <w:rPr>
-                <w:b/>
-                <w:color w:val="FFFFFF"/>
-              </w:rPr>
-              <w:t>Purpose</w:t>
-            </w:r>
-          </w:p>
-        </w:tc>
-      </w:tr>
-      <w:tr>
-        <w:tc>
-          <w:tcPr>
-            <w:tcW w:type="dxa" w:w="4320"/>
-          </w:tcPr>
-          <w:p>
-            <w:r>
-              <w:t>cisco.ios.ios_command</w:t>
-            </w:r>
-          </w:p>
-        </w:tc>
-        <w:tc>
-          <w:tcPr>
-            <w:tcW w:type="dxa" w:w="5040"/>
-          </w:tcPr>
-          <w:p>
-            <w:r>
-              <w:t>Run show commands on IOS devices</w:t>
-            </w:r>
-          </w:p>
-        </w:tc>
-      </w:tr>
-      <w:tr>
-        <w:tc>
-          <w:tcPr>
-            <w:tcW w:type="dxa" w:w="4320"/>
-          </w:tcPr>
-          <w:p>
-            <w:r>
-              <w:t>cisco.ios.ios_config</w:t>
-            </w:r>
-          </w:p>
-        </w:tc>
-        <w:tc>
-          <w:tcPr>
-            <w:tcW w:type="dxa" w:w="5040"/>
-          </w:tcPr>
-          <w:p>
-            <w:r>
-              <w:t>Push config lines to IOS devices</w:t>
-            </w:r>
-          </w:p>
-        </w:tc>
-      </w:tr>
-      <w:tr>
-        <w:tc>
-          <w:tcPr>
-            <w:tcW w:type="dxa" w:w="4320"/>
-          </w:tcPr>
-          <w:p>
-            <w:r>
-              <w:t>cisco.ios.ios_facts</w:t>
-            </w:r>
-          </w:p>
-        </w:tc>
-        <w:tc>
-          <w:tcPr>
-            <w:tcW w:type="dxa" w:w="5040"/>
-          </w:tcPr>
-          <w:p>
-            <w:r>
-              <w:t>Gather device facts (OS, interfaces, etc.)</w:t>
-            </w:r>
-          </w:p>
-        </w:tc>
-      </w:tr>
-      <w:tr>
-        <w:tc>
-          <w:tcPr>
-            <w:tcW w:type="dxa" w:w="4320"/>
-          </w:tcPr>
-          <w:p>
-            <w:r>
-              <w:t>ansible.netcommon.cli_command</w:t>
-            </w:r>
-          </w:p>
-        </w:tc>
-        <w:tc>
-          <w:tcPr>
-            <w:tcW w:type="dxa" w:w="5040"/>
-          </w:tcPr>
-          <w:p>
-            <w:r>
-              <w:t>Vendor-neutral CLI commands</w:t>
-            </w:r>
-          </w:p>
-        </w:tc>
-      </w:tr>
-      <w:tr>
-        <w:tc>
-          <w:tcPr>
-            <w:tcW w:type="dxa" w:w="4320"/>
-          </w:tcPr>
-          <w:p>
-            <w:r>
-              <w:t>ansible.netcommon.netconf_config</w:t>
-            </w:r>
-          </w:p>
-        </w:tc>
-        <w:tc>
-          <w:tcPr>
-            <w:tcW w:type="dxa" w:w="5040"/>
-          </w:tcPr>
-          <w:p>
-            <w:r>
-              <w:t>Push NETCONF XML payloads</w:t>
-            </w:r>
-          </w:p>
-        </w:tc>
-      </w:tr>
-      <w:tr>
-        <w:tc>
-          <w:tcPr>
-            <w:tcW w:type="dxa" w:w="4320"/>
-          </w:tcPr>
-          <w:p>
-            <w:r>
-              <w:t>community.general.napalm_get_facts</w:t>
-            </w:r>
-          </w:p>
-        </w:tc>
-        <w:tc>
-          <w:tcPr>
-            <w:tcW w:type="dxa" w:w="5040"/>
-          </w:tcPr>
-          <w:p>
-            <w:r>
-              <w:t>Normalised facts via NAPALM</w:t>
-            </w:r>
-          </w:p>
-        </w:tc>
-      </w:tr>
-    </w:tbl>
-    <w:p/>
-    <w:p>
-      <w:pPr>
         <w:pStyle w:val="Heading1"/>
       </w:pPr>
       <w:r>
@@ -1975,7 +1999,7 @@
     </w:p>
     <w:p>
       <w:r>
-        <w:t>REST and RESTCONF APIs provide structured, programmatic access to network devices and management platforms. This section covers three Python scripts: querying interface state, pushing configuration, and building dynamic Ansible inventory from NetBox.</w:t>
+        <w:t>This section uses two types of APIs: the local NetBox REST API as a source of truth, and several free, no-account public APIs for exploring real-world routing and network data.</w:t>
       </w:r>
     </w:p>
     <w:p>
@@ -1986,301 +2010,35 @@
         <w:rPr>
           <w:color w:val="2E74B5"/>
         </w:rPr>
-        <w:t>5.1 API Types</w:t>
-      </w:r>
-    </w:p>
-    <w:tbl>
-      <w:tblPr>
-        <w:tblStyle w:val="TableGrid"/>
-        <w:tblW w:type="auto" w:w="0"/>
-        <w:jc w:val="left"/>
-        <w:tblLook w:firstColumn="1" w:firstRow="1" w:lastColumn="0" w:lastRow="0" w:noHBand="0" w:noVBand="1" w:val="04A0"/>
-      </w:tblPr>
-      <w:tblGrid>
-        <w:gridCol w:w="1728"/>
-        <w:gridCol w:w="1728"/>
-        <w:gridCol w:w="1728"/>
-        <w:gridCol w:w="1728"/>
-        <w:gridCol w:w="1728"/>
-      </w:tblGrid>
-      <w:tr>
-        <w:tc>
-          <w:tcPr>
-            <w:tcW w:type="dxa" w:w="1728"/>
-            <w:shd w:val="clear" w:color="auto" w:fill="1F4E79"/>
-          </w:tcPr>
-          <w:p>
-            <w:r>
-              <w:rPr>
-                <w:b/>
-                <w:color w:val="FFFFFF"/>
-              </w:rPr>
-              <w:t>Type</w:t>
-            </w:r>
-          </w:p>
-        </w:tc>
-        <w:tc>
-          <w:tcPr>
-            <w:tcW w:type="dxa" w:w="1728"/>
-            <w:shd w:val="clear" w:color="auto" w:fill="1F4E79"/>
-          </w:tcPr>
-          <w:p>
-            <w:r>
-              <w:rPr>
-                <w:b/>
-                <w:color w:val="FFFFFF"/>
-              </w:rPr>
-              <w:t>Protocol</w:t>
-            </w:r>
-          </w:p>
-        </w:tc>
-        <w:tc>
-          <w:tcPr>
-            <w:tcW w:type="dxa" w:w="1152"/>
-            <w:shd w:val="clear" w:color="auto" w:fill="1F4E79"/>
-          </w:tcPr>
-          <w:p>
-            <w:r>
-              <w:rPr>
-                <w:b/>
-                <w:color w:val="FFFFFF"/>
-              </w:rPr>
-              <w:t>Port</w:t>
-            </w:r>
-          </w:p>
-        </w:tc>
-        <w:tc>
-          <w:tcPr>
-            <w:tcW w:type="dxa" w:w="1728"/>
-            <w:shd w:val="clear" w:color="auto" w:fill="1F4E79"/>
-          </w:tcPr>
-          <w:p>
-            <w:r>
-              <w:rPr>
-                <w:b/>
-                <w:color w:val="FFFFFF"/>
-              </w:rPr>
-              <w:t>Format</w:t>
-            </w:r>
-          </w:p>
-        </w:tc>
-        <w:tc>
-          <w:tcPr>
-            <w:tcW w:type="dxa" w:w="2880"/>
-            <w:shd w:val="clear" w:color="auto" w:fill="1F4E79"/>
-          </w:tcPr>
-          <w:p>
-            <w:r>
-              <w:rPr>
-                <w:b/>
-                <w:color w:val="FFFFFF"/>
-              </w:rPr>
-              <w:t>Used With</w:t>
-            </w:r>
-          </w:p>
-        </w:tc>
-      </w:tr>
-      <w:tr>
-        <w:tc>
-          <w:tcPr>
-            <w:tcW w:type="dxa" w:w="1728"/>
-          </w:tcPr>
-          <w:p>
-            <w:r>
-              <w:t>REST</w:t>
-            </w:r>
-          </w:p>
-        </w:tc>
-        <w:tc>
-          <w:tcPr>
-            <w:tcW w:type="dxa" w:w="1728"/>
-          </w:tcPr>
-          <w:p>
-            <w:r>
-              <w:t>HTTP/S</w:t>
-            </w:r>
-          </w:p>
-        </w:tc>
-        <w:tc>
-          <w:tcPr>
-            <w:tcW w:type="dxa" w:w="1152"/>
-          </w:tcPr>
-          <w:p>
-            <w:r>
-              <w:t>80/443</w:t>
-            </w:r>
-          </w:p>
-        </w:tc>
-        <w:tc>
-          <w:tcPr>
-            <w:tcW w:type="dxa" w:w="1728"/>
-          </w:tcPr>
-          <w:p>
-            <w:r>
-              <w:t>JSON</w:t>
-            </w:r>
-          </w:p>
-        </w:tc>
-        <w:tc>
-          <w:tcPr>
-            <w:tcW w:type="dxa" w:w="2880"/>
-          </w:tcPr>
-          <w:p>
-            <w:r>
-              <w:t>NMS, NetBox, Cisco DNA</w:t>
-            </w:r>
-          </w:p>
-        </w:tc>
-      </w:tr>
-      <w:tr>
-        <w:tc>
-          <w:tcPr>
-            <w:tcW w:type="dxa" w:w="1728"/>
-          </w:tcPr>
-          <w:p>
-            <w:r>
-              <w:t>RESTCONF</w:t>
-            </w:r>
-          </w:p>
-        </w:tc>
-        <w:tc>
-          <w:tcPr>
-            <w:tcW w:type="dxa" w:w="1728"/>
-          </w:tcPr>
-          <w:p>
-            <w:r>
-              <w:t>HTTPS</w:t>
-            </w:r>
-          </w:p>
-        </w:tc>
-        <w:tc>
-          <w:tcPr>
-            <w:tcW w:type="dxa" w:w="1152"/>
-          </w:tcPr>
-          <w:p>
-            <w:r>
-              <w:t>443</w:t>
-            </w:r>
-          </w:p>
-        </w:tc>
-        <w:tc>
-          <w:tcPr>
-            <w:tcW w:type="dxa" w:w="1728"/>
-          </w:tcPr>
-          <w:p>
-            <w:r>
-              <w:t>JSON/XML</w:t>
-            </w:r>
-          </w:p>
-        </w:tc>
-        <w:tc>
-          <w:tcPr>
-            <w:tcW w:type="dxa" w:w="2880"/>
-          </w:tcPr>
-          <w:p>
-            <w:r>
-              <w:t>IOS-XE, NX-OS</w:t>
-            </w:r>
-          </w:p>
-        </w:tc>
-      </w:tr>
-      <w:tr>
-        <w:tc>
-          <w:tcPr>
-            <w:tcW w:type="dxa" w:w="1728"/>
-          </w:tcPr>
-          <w:p>
-            <w:r>
-              <w:t>NETCONF</w:t>
-            </w:r>
-          </w:p>
-        </w:tc>
-        <w:tc>
-          <w:tcPr>
-            <w:tcW w:type="dxa" w:w="1728"/>
-          </w:tcPr>
-          <w:p>
-            <w:r>
-              <w:t>SSH</w:t>
-            </w:r>
-          </w:p>
-        </w:tc>
-        <w:tc>
-          <w:tcPr>
-            <w:tcW w:type="dxa" w:w="1152"/>
-          </w:tcPr>
-          <w:p>
-            <w:r>
-              <w:t>830</w:t>
-            </w:r>
-          </w:p>
-        </w:tc>
-        <w:tc>
-          <w:tcPr>
-            <w:tcW w:type="dxa" w:w="1728"/>
-          </w:tcPr>
-          <w:p>
-            <w:r>
-              <w:t>XML</w:t>
-            </w:r>
-          </w:p>
-        </w:tc>
-        <w:tc>
-          <w:tcPr>
-            <w:tcW w:type="dxa" w:w="2880"/>
-          </w:tcPr>
-          <w:p>
-            <w:r>
-              <w:t>IOS-XE, Junos, NX-OS</w:t>
-            </w:r>
-          </w:p>
-        </w:tc>
-      </w:tr>
-    </w:tbl>
-    <w:p/>
-    <w:p>
-      <w:pPr>
-        <w:pStyle w:val="Heading2"/>
-      </w:pPr>
-      <w:r>
-        <w:rPr>
-          <w:color w:val="2E74B5"/>
-        </w:rPr>
-        <w:t>5.2 Script 1 — GET Interface Status</w:t>
+        <w:t>5.1 Script 1 — NetBox: Query Devices</w:t>
       </w:r>
     </w:p>
     <w:p>
       <w:r>
-        <w:t>Queries the RESTCONF interfaces endpoint and prints a formatted table.</w:t>
+        <w:t>Fetches active devices from the local NetBox instance and prints a summary table. Students then extend the script to POST a new device via the API.</w:t>
       </w:r>
     </w:p>
     <w:p>
       <w:pPr>
         <w:ind w:left="283"/>
-        <w:shd w:val="clear" w:color="auto" w:fill="F0F0F0"/>
+        <w:shd w:val="clear" w:color="auto" w:fill="EFEFEF"/>
       </w:pPr>
       <w:r>
         <w:rPr>
           <w:rFonts w:ascii="Courier New" w:hAnsi="Courier New"/>
-          <w:color w:val="202020"/>
+          <w:color w:val="1A1A1A"/>
           <w:sz w:val="16"/>
         </w:rPr>
-        <w:t>import requests</w:t>
+        <w:t>NETBOX_URL   = 'http://10.0.0.100:8000'</w:t>
         <w:br/>
-        <w:t>from requests.auth import HTTPBasicAuth</w:t>
+        <w:t>NETBOX_TOKEN = 'your_token_here'</w:t>
         <w:br/>
         <w:br/>
-        <w:t>url = "https://10.0.0.1/restconf/data/ietf-interfaces:interfaces"</w:t>
+        <w:t>headers = {'Authorization': f'Token {NETBOX_TOKEN}'}</w:t>
         <w:br/>
-        <w:t>resp = requests.get(url,</w:t>
+        <w:t>resp = requests.get(f'{NETBOX_URL}/api/dcim/devices/?status=active', headers=headers)</w:t>
         <w:br/>
-        <w:t xml:space="preserve">    auth=HTTPBasicAuth("admin", "Lab@1234"),</w:t>
-        <w:br/>
-        <w:t xml:space="preserve">    headers={"Accept": "application/yang-data+json"},</w:t>
-        <w:br/>
-        <w:t xml:space="preserve">    verify=False)</w:t>
-        <w:br/>
-        <w:t>data = resp.json()</w:t>
+        <w:t>devices = resp.json()['results']</w:t>
       </w:r>
     </w:p>
     <w:p>
@@ -2291,46 +2049,12 @@
         <w:rPr>
           <w:color w:val="2E74B5"/>
         </w:rPr>
-        <w:t>5.3 Script 2 — PUT Interface Configuration</w:t>
+        <w:t>5.2 Script 2 — RESTCONF: Push Interface Config</w:t>
       </w:r>
     </w:p>
     <w:p>
       <w:r>
-        <w:t>Pushes a JSON payload to configure an interface via RESTCONF PUT.</w:t>
-      </w:r>
-    </w:p>
-    <w:p>
-      <w:pPr>
-        <w:ind w:left="283"/>
-        <w:shd w:val="clear" w:color="auto" w:fill="F0F0F0"/>
-      </w:pPr>
-      <w:r>
-        <w:rPr>
-          <w:rFonts w:ascii="Courier New" w:hAnsi="Courier New"/>
-          <w:color w:val="202020"/>
-          <w:sz w:val="16"/>
-        </w:rPr>
-        <w:t>payload = {</w:t>
-        <w:br/>
-        <w:t xml:space="preserve">  "ietf-interfaces:interface": {</w:t>
-        <w:br/>
-        <w:t xml:space="preserve">    "name": "GigabitEthernet0/1",</w:t>
-        <w:br/>
-        <w:t xml:space="preserve">    "description": "LAN_SEGMENT_AUTOMATED",</w:t>
-        <w:br/>
-        <w:t xml:space="preserve">    "enabled": True,</w:t>
-        <w:br/>
-        <w:t xml:space="preserve">    "ietf-ip:ipv4": {</w:t>
-        <w:br/>
-        <w:t xml:space="preserve">      "address": [{"ip": "10.0.0.1", "prefix-length": 24}]</w:t>
-        <w:br/>
-        <w:t xml:space="preserve">    }</w:t>
-        <w:br/>
-        <w:t xml:space="preserve">  }</w:t>
-        <w:br/>
-        <w:t>}</w:t>
-        <w:br/>
-        <w:t>resp = requests.put(url, json=payload, auth=auth, headers=headers, verify=False)</w:t>
+        <w:t>Uses RESTCONF (RFC 8040) and HTTP PUT to configure GigabitEthernet0/1 on Router-1 with a description and IP address using the ietf-interfaces YANG model.</w:t>
       </w:r>
     </w:p>
     <w:p>
@@ -2341,12 +2065,39 @@
         <w:rPr>
           <w:color w:val="2E74B5"/>
         </w:rPr>
-        <w:t>5.4 Script 3 — NetBox Dynamic Inventory</w:t>
+        <w:t>5.3 Script 3 — BGPView: Real Routing Data (Free, No Auth)</w:t>
       </w:r>
     </w:p>
     <w:p>
       <w:r>
-        <w:t>Pulls all active devices from NetBox and outputs Ansible-compatible JSON inventory grouped by device role. Use as: ansible-playbook pb.yml -i 03_netbox_inventory.py</w:t>
+        <w:t>Queries the BGPView public API to look up ASN information and IPv4 prefixes. Students use Cloudflare (AS13335) as a starting point, then look up their own ISP.</w:t>
+      </w:r>
+    </w:p>
+    <w:p>
+      <w:pPr>
+        <w:ind w:left="283"/>
+        <w:shd w:val="clear" w:color="auto" w:fill="EFEFEF"/>
+      </w:pPr>
+      <w:r>
+        <w:rPr>
+          <w:rFonts w:ascii="Courier New" w:hAnsi="Courier New"/>
+          <w:color w:val="1A1A1A"/>
+          <w:sz w:val="16"/>
+        </w:rPr>
+        <w:t># Look up Cloudflare (no auth required)</w:t>
+        <w:br/>
+        <w:t>resp = requests.get('https://api.bgpview.io/asn/13335')</w:t>
+        <w:br/>
+        <w:t>data = resp.json()['data']</w:t>
+        <w:br/>
+        <w:t>print(data['name'], data['country_code'])</w:t>
+        <w:br/>
+        <w:br/>
+        <w:t># List their prefixes</w:t>
+        <w:br/>
+        <w:t>resp = requests.get('https://api.bgpview.io/asn/13335/prefixes')</w:t>
+        <w:br/>
+        <w:t>prefixes = resp.json()['data']['ipv4_prefixes']</w:t>
       </w:r>
     </w:p>
     <w:p>
@@ -2357,7 +2108,45 @@
         <w:rPr>
           <w:color w:val="2E74B5"/>
         </w:rPr>
-        <w:t>5.5 RESTCONF Quick Reference</w:t>
+        <w:t>5.4 Script 4 — Cisco DevNet Always-On Sandbox (Free)</w:t>
+      </w:r>
+    </w:p>
+    <w:p>
+      <w:r>
+        <w:t>Connects to Cisco's free, always-on IOS-XE sandbox using RESTCONF. No sign-up required. Students query interfaces, then compare the YANG model output to show ip interface brief.</w:t>
+      </w:r>
+    </w:p>
+    <w:p>
+      <w:pPr>
+        <w:ind w:left="283"/>
+        <w:shd w:val="clear" w:color="auto" w:fill="EFEFEF"/>
+      </w:pPr>
+      <w:r>
+        <w:rPr>
+          <w:rFonts w:ascii="Courier New" w:hAnsi="Courier New"/>
+          <w:color w:val="1A1A1A"/>
+          <w:sz w:val="16"/>
+        </w:rPr>
+        <w:t>SANDBOX = 'sandbox-iosxe-latest-1.cisco.com'</w:t>
+        <w:br/>
+        <w:t>auth    = HTTPBasicAuth('devnetuser', 'Cisco123!')</w:t>
+        <w:br/>
+        <w:t>url     = f'https://{SANDBOX}/restconf/data/ietf-interfaces:interfaces'</w:t>
+        <w:br/>
+        <w:t>resp    = requests.get(url, auth=auth, headers=HEADERS, verify=False)</w:t>
+        <w:br/>
+        <w:t>interfaces = resp.json()['ietf-interfaces:interfaces']['interface']</w:t>
+      </w:r>
+    </w:p>
+    <w:p>
+      <w:pPr>
+        <w:pStyle w:val="Heading2"/>
+      </w:pPr>
+      <w:r>
+        <w:rPr>
+          <w:color w:val="2E74B5"/>
+        </w:rPr>
+        <w:t>5.5 Other Free APIs to Explore</w:t>
       </w:r>
     </w:p>
     <w:tbl>
@@ -2384,13 +2173,13 @@
                 <w:b/>
                 <w:color w:val="FFFFFF"/>
               </w:rPr>
-              <w:t>HTTP Method</w:t>
+              <w:t>API</w:t>
             </w:r>
           </w:p>
         </w:tc>
         <w:tc>
           <w:tcPr>
-            <w:tcW w:type="dxa" w:w="2160"/>
+            <w:tcW w:type="dxa" w:w="4320"/>
             <w:shd w:val="clear" w:color="auto" w:fill="1F4E79"/>
           </w:tcPr>
           <w:p>
@@ -2399,13 +2188,13 @@
                 <w:b/>
                 <w:color w:val="FFFFFF"/>
               </w:rPr>
-              <w:t>Action</w:t>
+              <w:t>Example Call</w:t>
             </w:r>
           </w:p>
         </w:tc>
         <w:tc>
           <w:tcPr>
-            <w:tcW w:type="dxa" w:w="5040"/>
+            <w:tcW w:type="dxa" w:w="2880"/>
             <w:shd w:val="clear" w:color="auto" w:fill="1F4E79"/>
           </w:tcPr>
           <w:p>
@@ -2414,7 +2203,7 @@
                 <w:b/>
                 <w:color w:val="FFFFFF"/>
               </w:rPr>
-              <w:t>Example Path</w:t>
+              <w:t>Returns</w:t>
             </w:r>
           </w:p>
         </w:tc>
@@ -2426,27 +2215,27 @@
           </w:tcPr>
           <w:p>
             <w:r>
-              <w:t>GET</w:t>
+              <w:t>PeeringDB</w:t>
             </w:r>
           </w:p>
         </w:tc>
         <w:tc>
           <w:tcPr>
-            <w:tcW w:type="dxa" w:w="2160"/>
+            <w:tcW w:type="dxa" w:w="4320"/>
           </w:tcPr>
           <w:p>
             <w:r>
-              <w:t>Read config/state</w:t>
+              <w:t>GET /api/ix?name=AMS-IX</w:t>
             </w:r>
           </w:p>
         </w:tc>
         <w:tc>
           <w:tcPr>
-            <w:tcW w:type="dxa" w:w="5040"/>
+            <w:tcW w:type="dxa" w:w="2880"/>
           </w:tcPr>
           <w:p>
             <w:r>
-              <w:t>/restconf/data/ietf-interfaces:interfaces</w:t>
+              <w:t>Internet exchange details</w:t>
             </w:r>
           </w:p>
         </w:tc>
@@ -2458,27 +2247,27 @@
           </w:tcPr>
           <w:p>
             <w:r>
-              <w:t>PUT</w:t>
+              <w:t>ipinfo.io</w:t>
             </w:r>
           </w:p>
         </w:tc>
         <w:tc>
           <w:tcPr>
-            <w:tcW w:type="dxa" w:w="2160"/>
+            <w:tcW w:type="dxa" w:w="4320"/>
           </w:tcPr>
           <w:p>
             <w:r>
-              <w:t>Replace resource</w:t>
+              <w:t>GET https://ipinfo.io/8.8.8.8</w:t>
             </w:r>
           </w:p>
         </w:tc>
         <w:tc>
           <w:tcPr>
-            <w:tcW w:type="dxa" w:w="5040"/>
+            <w:tcW w:type="dxa" w:w="2880"/>
           </w:tcPr>
           <w:p>
             <w:r>
-              <w:t>/restconf/data/.../interface=Gi0%2F1</w:t>
+              <w:t>IP geo, ASN, org</w:t>
             </w:r>
           </w:p>
         </w:tc>
@@ -2490,91 +2279,27 @@
           </w:tcPr>
           <w:p>
             <w:r>
-              <w:t>PATCH</w:t>
+              <w:t>httpbin.org</w:t>
             </w:r>
           </w:p>
         </w:tc>
         <w:tc>
           <w:tcPr>
-            <w:tcW w:type="dxa" w:w="2160"/>
+            <w:tcW w:type="dxa" w:w="4320"/>
           </w:tcPr>
           <w:p>
             <w:r>
-              <w:t>Merge/update</w:t>
+              <w:t>POST /post  (any JSON body)</w:t>
             </w:r>
           </w:p>
         </w:tc>
         <w:tc>
           <w:tcPr>
-            <w:tcW w:type="dxa" w:w="5040"/>
+            <w:tcW w:type="dxa" w:w="2880"/>
           </w:tcPr>
           <w:p>
             <w:r>
-              <w:t>/restconf/data/.../interface=Gi0%2F1</w:t>
-            </w:r>
-          </w:p>
-        </w:tc>
-      </w:tr>
-      <w:tr>
-        <w:tc>
-          <w:tcPr>
-            <w:tcW w:type="dxa" w:w="2160"/>
-          </w:tcPr>
-          <w:p>
-            <w:r>
-              <w:t>POST</w:t>
-            </w:r>
-          </w:p>
-        </w:tc>
-        <w:tc>
-          <w:tcPr>
-            <w:tcW w:type="dxa" w:w="2160"/>
-          </w:tcPr>
-          <w:p>
-            <w:r>
-              <w:t>Create resource</w:t>
-            </w:r>
-          </w:p>
-        </w:tc>
-        <w:tc>
-          <w:tcPr>
-            <w:tcW w:type="dxa" w:w="5040"/>
-          </w:tcPr>
-          <w:p>
-            <w:r>
-              <w:t>/restconf/data/ietf-interfaces:interfaces</w:t>
-            </w:r>
-          </w:p>
-        </w:tc>
-      </w:tr>
-      <w:tr>
-        <w:tc>
-          <w:tcPr>
-            <w:tcW w:type="dxa" w:w="2160"/>
-          </w:tcPr>
-          <w:p>
-            <w:r>
-              <w:t>DELETE</w:t>
-            </w:r>
-          </w:p>
-        </w:tc>
-        <w:tc>
-          <w:tcPr>
-            <w:tcW w:type="dxa" w:w="2160"/>
-          </w:tcPr>
-          <w:p>
-            <w:r>
-              <w:t>Remove resource</w:t>
-            </w:r>
-          </w:p>
-        </w:tc>
-        <w:tc>
-          <w:tcPr>
-            <w:tcW w:type="dxa" w:w="5040"/>
-          </w:tcPr>
-          <w:p>
-            <w:r>
-              <w:t>/restconf/data/.../interface=Gi0%2F1</w:t>
+              <w:t>Echo of your request</w:t>
             </w:r>
           </w:p>
         </w:tc>
@@ -2594,69 +2319,53 @@
     </w:p>
     <w:p>
       <w:r>
-        <w:t>Combining all three tools creates a fully auditable, repeatable change pipeline:</w:t>
+        <w:t>Combining all three sections into a repeatable, auditable change workflow:</w:t>
       </w:r>
     </w:p>
     <w:p>
       <w:pPr>
         <w:ind w:left="283"/>
-        <w:shd w:val="clear" w:color="auto" w:fill="F0F0F0"/>
+        <w:shd w:val="clear" w:color="auto" w:fill="EFEFEF"/>
       </w:pPr>
       <w:r>
         <w:rPr>
           <w:rFonts w:ascii="Courier New" w:hAnsi="Courier New"/>
-          <w:color w:val="202020"/>
+          <w:color w:val="1A1A1A"/>
           <w:sz w:val="16"/>
         </w:rPr>
         <w:t>CHANGE REQUEST</w:t>
         <w:br/>
         <w:t xml:space="preserve">      │</w:t>
         <w:br/>
-        <w:t xml:space="preserve">      ▼</w:t>
-        <w:br/>
-        <w:t xml:space="preserve">  git checkout -b change/CR-XXXX        ← Branch from main</w:t>
+        <w:t xml:space="preserve">  git checkout -b change/CR-XXXX      ← branch from main</w:t>
         <w:br/>
         <w:t xml:space="preserve">      │</w:t>
         <w:br/>
-        <w:t xml:space="preserve">      ▼</w:t>
-        <w:br/>
-        <w:t xml:space="preserve">  Edit YAML vars / config template       ← Define desired state</w:t>
+        <w:t xml:space="preserve">  Edit YAML vars / Jinja2 template    ← define desired state</w:t>
         <w:br/>
         <w:t xml:space="preserve">      │</w:t>
         <w:br/>
-        <w:t xml:space="preserve">      ▼</w:t>
-        <w:br/>
-        <w:t xml:space="preserve">  ansible-playbook pb.yml --check --diff ← Preview changes</w:t>
+        <w:t xml:space="preserve">  ansible-playbook --check --diff     ← preview diff</w:t>
         <w:br/>
         <w:t xml:space="preserve">      │</w:t>
         <w:br/>
-        <w:t xml:space="preserve">      ▼</w:t>
-        <w:br/>
-        <w:t xml:space="preserve">  Pull Request → Peer Review             ← Human gate</w:t>
+        <w:t xml:space="preserve">  Pull Request → Peer Review          ← human gate</w:t>
         <w:br/>
         <w:t xml:space="preserve">      │</w:t>
         <w:br/>
-        <w:t xml:space="preserve">      ▼</w:t>
-        <w:br/>
-        <w:t xml:space="preserve">  git merge --no-ff                      ← Merge to main</w:t>
+        <w:t xml:space="preserve">  git merge --no-ff                   ← merge to main</w:t>
         <w:br/>
         <w:t xml:space="preserve">      │</w:t>
         <w:br/>
-        <w:t xml:space="preserve">      ▼</w:t>
-        <w:br/>
-        <w:t xml:space="preserve">  ansible-playbook pb.yml                ← Apply to devices</w:t>
+        <w:t xml:space="preserve">  ansible-playbook (apply)            ← push to devices</w:t>
         <w:br/>
         <w:t xml:space="preserve">      │</w:t>
         <w:br/>
-        <w:t xml:space="preserve">      ▼</w:t>
-        <w:br/>
-        <w:t xml:space="preserve">  python3 03-compliance-check.py         ← Verify via API</w:t>
+        <w:t xml:space="preserve">  python3 01_netbox_get_devices.py    ← verify via NetBox API</w:t>
         <w:br/>
         <w:t xml:space="preserve">      │</w:t>
         <w:br/>
-        <w:t xml:space="preserve">      ▼</w:t>
-        <w:br/>
-        <w:t xml:space="preserve">  git tag v1.x                           ← Tag golden state</w:t>
+        <w:t xml:space="preserve">  git tag v1.x                        ← tag golden state</w:t>
       </w:r>
     </w:p>
     <w:p>
@@ -2667,7 +2376,7 @@
         <w:rPr>
           <w:color w:val="1F4E79"/>
         </w:rPr>
-        <w:t>7. Lab Completion Criteria</w:t>
+        <w:t>7. Lab Completion Checklist</w:t>
       </w:r>
     </w:p>
     <w:tbl>
@@ -2700,7 +2409,7 @@
         </w:tc>
         <w:tc>
           <w:tcPr>
-            <w:tcW w:type="dxa" w:w="5760"/>
+            <w:tcW w:type="dxa" w:w="6048"/>
             <w:shd w:val="clear" w:color="auto" w:fill="1F4E79"/>
           </w:tcPr>
           <w:p>
@@ -2742,11 +2451,11 @@
         </w:tc>
         <w:tc>
           <w:tcPr>
-            <w:tcW w:type="dxa" w:w="5760"/>
+            <w:tcW w:type="dxa" w:w="6048"/>
           </w:tcPr>
           <w:p>
             <w:r>
-              <w:t>Repository initialised with at least one config file</w:t>
+              <w:t>Repo initialised with at least one config file</w:t>
             </w:r>
           </w:p>
         </w:tc>
@@ -2774,11 +2483,11 @@
         </w:tc>
         <w:tc>
           <w:tcPr>
-            <w:tcW w:type="dxa" w:w="5760"/>
+            <w:tcW w:type="dxa" w:w="6048"/>
           </w:tcPr>
           <w:p>
             <w:r>
-              <w:t>At least two commits visible in git log</w:t>
+              <w:t>At least two commits in git log</w:t>
             </w:r>
           </w:p>
         </w:tc>
@@ -2806,11 +2515,11 @@
         </w:tc>
         <w:tc>
           <w:tcPr>
-            <w:tcW w:type="dxa" w:w="5760"/>
+            <w:tcW w:type="dxa" w:w="6048"/>
           </w:tcPr>
           <w:p>
             <w:r>
-              <w:t>Feature branch created and merged</w:t>
+              <w:t>Feature branch created and merged via merge request</w:t>
             </w:r>
           </w:p>
         </w:tc>
@@ -2838,7 +2547,7 @@
         </w:tc>
         <w:tc>
           <w:tcPr>
-            <w:tcW w:type="dxa" w:w="5760"/>
+            <w:tcW w:type="dxa" w:w="6048"/>
           </w:tcPr>
           <w:p>
             <w:r>
@@ -2870,11 +2579,11 @@
         </w:tc>
         <w:tc>
           <w:tcPr>
-            <w:tcW w:type="dxa" w:w="5760"/>
+            <w:tcW w:type="dxa" w:w="6048"/>
           </w:tcPr>
           <w:p>
             <w:r>
-              <w:t>Inventory file with at least 2 device groups</w:t>
+              <w:t>Inventory with routers + switches groups</w:t>
             </w:r>
           </w:p>
         </w:tc>
@@ -2902,11 +2611,11 @@
         </w:tc>
         <w:tc>
           <w:tcPr>
-            <w:tcW w:type="dxa" w:w="5760"/>
+            <w:tcW w:type="dxa" w:w="6048"/>
           </w:tcPr>
           <w:p>
             <w:r>
-              <w:t>gather-facts playbook runs successfully</w:t>
+              <w:t>gather-facts playbook runs on all devices</w:t>
             </w:r>
           </w:p>
         </w:tc>
@@ -2934,11 +2643,11 @@
         </w:tc>
         <w:tc>
           <w:tcPr>
-            <w:tcW w:type="dxa" w:w="5760"/>
+            <w:tcW w:type="dxa" w:w="6048"/>
           </w:tcPr>
           <w:p>
             <w:r>
-              <w:t>push-config playbook applies change via Jinja2 template</w:t>
+              <w:t>push-config applies change via Jinja2 template</w:t>
             </w:r>
           </w:p>
         </w:tc>
@@ -2966,11 +2675,43 @@
         </w:tc>
         <w:tc>
           <w:tcPr>
-            <w:tcW w:type="dxa" w:w="5760"/>
+            <w:tcW w:type="dxa" w:w="6048"/>
           </w:tcPr>
           <w:p>
             <w:r>
-              <w:t>compliance-check playbook generates a report</w:t>
+              <w:t>compliance-check generates a report</w:t>
+            </w:r>
+          </w:p>
+        </w:tc>
+        <w:tc>
+          <w:tcPr>
+            <w:tcW w:type="dxa" w:w="1152"/>
+          </w:tcPr>
+          <w:p>
+            <w:r>
+              <w:t>☐</w:t>
+            </w:r>
+          </w:p>
+        </w:tc>
+      </w:tr>
+      <w:tr>
+        <w:tc>
+          <w:tcPr>
+            <w:tcW w:type="dxa" w:w="1728"/>
+          </w:tcPr>
+          <w:p>
+            <w:r>
+              <w:t>Ansible</w:t>
+            </w:r>
+          </w:p>
+        </w:tc>
+        <w:tc>
+          <w:tcPr>
+            <w:tcW w:type="dxa" w:w="6048"/>
+          </w:tcPr>
+          <w:p>
+            <w:r>
+              <w:t>--check --diff used before every real push</w:t>
             </w:r>
           </w:p>
         </w:tc>
@@ -2998,11 +2739,11 @@
         </w:tc>
         <w:tc>
           <w:tcPr>
-            <w:tcW w:type="dxa" w:w="5760"/>
+            <w:tcW w:type="dxa" w:w="6048"/>
           </w:tcPr>
           <w:p>
             <w:r>
-              <w:t>Script 1 queries and prints interface data</w:t>
+              <w:t>Script 1 queries NetBox and adds a device via POST</w:t>
             </w:r>
           </w:p>
         </w:tc>
@@ -3030,11 +2771,11 @@
         </w:tc>
         <w:tc>
           <w:tcPr>
-            <w:tcW w:type="dxa" w:w="5760"/>
+            <w:tcW w:type="dxa" w:w="6048"/>
           </w:tcPr>
           <w:p>
             <w:r>
-              <w:t>Script 2 applies config change via RESTCONF PUT</w:t>
+              <w:t>Script 2 applies interface config via RESTCONF PUT</w:t>
             </w:r>
           </w:p>
         </w:tc>
@@ -3062,11 +2803,11 @@
         </w:tc>
         <w:tc>
           <w:tcPr>
-            <w:tcW w:type="dxa" w:w="5760"/>
+            <w:tcW w:type="dxa" w:w="6048"/>
           </w:tcPr>
           <w:p>
             <w:r>
-              <w:t>Script 3 generates Ansible-compatible inventory from NetBox</w:t>
+              <w:t>Script 3 looks up an ASN and parses BGP prefixes</w:t>
             </w:r>
           </w:p>
         </w:tc>
@@ -3094,11 +2835,11 @@
         </w:tc>
         <w:tc>
           <w:tcPr>
-            <w:tcW w:type="dxa" w:w="5760"/>
+            <w:tcW w:type="dxa" w:w="6048"/>
           </w:tcPr>
           <w:p>
             <w:r>
-              <w:t>All scripts handle HTTP errors gracefully</w:t>
+              <w:t>Script 4 queries Cisco DevNet sandbox interfaces</w:t>
             </w:r>
           </w:p>
         </w:tc>
@@ -3126,7 +2867,7 @@
         </w:tc>
         <w:tc>
           <w:tcPr>
-            <w:tcW w:type="dxa" w:w="5760"/>
+            <w:tcW w:type="dxa" w:w="6048"/>
           </w:tcPr>
           <w:p>
             <w:r>
@@ -3157,7 +2898,7 @@
           <w:color w:val="808080"/>
           <w:sz w:val="18"/>
         </w:rPr>
-        <w:t>Network Automation Bootcamp v1.0  ·  May 2026</w:t>
+        <w:t>Network Automation Bootcamp v2.0  ·  May 2026  ·  10–12 Students</w:t>
       </w:r>
     </w:p>
     <w:sectPr>

</xml_diff>

<commit_message>
changed ip addresses for lab devices
</commit_message>
<xml_diff>
--- a/Network_Automation_Bootcamp_Lab_Guide.docx
+++ b/Network_Automation_Bootcamp_Lab_Guide.docx
@@ -37,7 +37,7 @@
         <w:rPr>
           <w:sz w:val="22"/>
         </w:rPr>
-        <w:t>Version 2.0   |   May 2026   |   10–12 Students</w:t>
+        <w:t>Version 2.0   |   July 2026   |   10–12 Students</w:t>
       </w:r>
     </w:p>
     <w:p>
@@ -489,7 +489,7 @@
     </w:p>
     <w:p>
       <w:r>
-        <w:t>The lab is divided into three networks: the classroom management network (10.0.0.0/24) where students, the control node, NetBox, and the Git server live; the device network (10.0.1.0/24) for the routers and switch; and the internet for free public API access.</w:t>
+        <w:t>The lab spans three networks: the classroom management network (10.0.0.0/24) where students and the Git server live; the automation &amp; device network (10.106.106.0/24) where the control node and the routers/switch live; NetBox on its own network (10.100.100.0/24); and the internet for free public API access.</w:t>
       </w:r>
     </w:p>
     <w:p>
@@ -533,35 +533,41 @@
         <w:br/>
         <w:t xml:space="preserve">                             │</w:t>
         <w:br/>
-        <w:t xml:space="preserve">        ┌────────────────────┼───────────────┐</w:t>
+        <w:t xml:space="preserve">                        GIT SERVER            NETBOX</w:t>
         <w:br/>
-        <w:t xml:space="preserve">        │                    │               │</w:t>
+        <w:t xml:space="preserve">                        10.0.0.60          10.100.100.25</w:t>
         <w:br/>
-        <w:t xml:space="preserve"> CONTROL NODE          NETBOX           GIT SERVER</w:t>
+        <w:t xml:space="preserve">                        (Gitea)              :8000 (IPAM)</w:t>
         <w:br/>
-        <w:t xml:space="preserve"> 10.0.0.50             10.0.0.100       10.0.0.60</w:t>
+        <w:t xml:space="preserve">                             │                    │</w:t>
         <w:br/>
-        <w:t xml:space="preserve"> Git/Ansible/Python    :8000 (IPAM)     (Gitea)</w:t>
+        <w:t>═════════════════════════════╪════════════════════╪══════</w:t>
         <w:br/>
-        <w:t xml:space="preserve">        │                    │</w:t>
+        <w:t xml:space="preserve">     AUTOMATION &amp; DEVICE NETWORK  10.106.106.0/24</w:t>
         <w:br/>
-        <w:t xml:space="preserve">        └──────────┬─────────┘</w:t>
+        <w:t>═════════════════════════════╪════════════════════╪══════</w:t>
         <w:br/>
-        <w:t xml:space="preserve">                   │ SSH / RESTCONF / Ansible</w:t>
+        <w:t xml:space="preserve">                             │                    │</w:t>
         <w:br/>
-        <w:t>═══════════════════╪══════════════════════════════</w:t>
+        <w:t xml:space="preserve">                       CONTROL NODE ◄── REST API ──┘</w:t>
         <w:br/>
-        <w:t xml:space="preserve">         DEVICE NETWORK  10.0.1.0/24</w:t>
+        <w:t xml:space="preserve">                       10.106.106.60</w:t>
         <w:br/>
-        <w:t>═══════════════════╪══════════════════════════════</w:t>
+        <w:t xml:space="preserve">                       Git/Ansible/Python</w:t>
         <w:br/>
-        <w:t xml:space="preserve">       ┌───────────┼──────────────┐</w:t>
+        <w:t xml:space="preserve">                             │</w:t>
         <w:br/>
-        <w:t xml:space="preserve">  ROUTER-1    ROUTER-2       SWITCH-1</w:t>
+        <w:t xml:space="preserve">                             │ SSH / RESTCONF / Ansible</w:t>
         <w:br/>
-        <w:t xml:space="preserve">  10.0.1.1    10.0.1.2       10.0.1.10</w:t>
+        <w:t xml:space="preserve">       ┌─────────────────────┼───────────────┐</w:t>
         <w:br/>
-        <w:t xml:space="preserve">  IOS-XE      NX-OS          IOS  VLANs</w:t>
+        <w:t xml:space="preserve">       │                     │               │</w:t>
+        <w:br/>
+        <w:t xml:space="preserve">  ROUTER-1              ROUTER-2        SWITCH-1</w:t>
+        <w:br/>
+        <w:t xml:space="preserve">  10.106.106.61          10.106.106.62   10.106.106.63</w:t>
+        <w:br/>
+        <w:t xml:space="preserve">  IOS-XE                 NX-OS           IOS  VLANs</w:t>
         <w:br/>
         <w:br/>
         <w:t>═══════════════════════════════════════════════════</w:t>
@@ -658,7 +664,7 @@
           </w:tcPr>
           <w:p>
             <w:r>
-              <w:t>10.0.0.50</w:t>
+              <w:t>10.106.106.60</w:t>
             </w:r>
           </w:p>
         </w:tc>
@@ -690,7 +696,7 @@
           </w:tcPr>
           <w:p>
             <w:r>
-              <w:t>10.0.0.100</w:t>
+              <w:t>10.100.100.25</w:t>
             </w:r>
           </w:p>
         </w:tc>
@@ -754,7 +760,7 @@
           </w:tcPr>
           <w:p>
             <w:r>
-              <w:t>10.0.1.1</w:t>
+              <w:t>10.106.106.61</w:t>
             </w:r>
           </w:p>
         </w:tc>
@@ -786,7 +792,7 @@
           </w:tcPr>
           <w:p>
             <w:r>
-              <w:t>10.0.1.2</w:t>
+              <w:t>10.106.106.62</w:t>
             </w:r>
           </w:p>
         </w:tc>
@@ -818,7 +824,7 @@
           </w:tcPr>
           <w:p>
             <w:r>
-              <w:t>10.0.1.10</w:t>
+              <w:t>10.106.106.63</w:t>
             </w:r>
           </w:p>
         </w:tc>
@@ -1705,7 +1711,7 @@
           </w:tcPr>
           <w:p>
             <w:r>
-              <w:t>10.0.1.1</w:t>
+              <w:t>10.106.106.61</w:t>
             </w:r>
           </w:p>
         </w:tc>
@@ -1747,7 +1753,7 @@
           </w:tcPr>
           <w:p>
             <w:r>
-              <w:t>10.0.1.2</w:t>
+              <w:t>10.106.106.62</w:t>
             </w:r>
           </w:p>
         </w:tc>
@@ -1789,7 +1795,7 @@
           </w:tcPr>
           <w:p>
             <w:r>
-              <w:t>10.0.1.10</w:t>
+              <w:t>10.106.106.63</w:t>
             </w:r>
           </w:p>
         </w:tc>
@@ -1840,14 +1846,14 @@
         </w:rPr>
         <w:t>[routers]</w:t>
         <w:br/>
-        <w:t>router1 ansible_host=10.0.1.1</w:t>
+        <w:t>router1 ansible_host=10.106.106.61</w:t>
         <w:br/>
-        <w:t>router2 ansible_host=10.0.1.2</w:t>
+        <w:t>router2 ansible_host=10.106.106.62</w:t>
         <w:br/>
         <w:br/>
         <w:t>[switches]</w:t>
         <w:br/>
-        <w:t>switch1 ansible_host=10.0.1.10</w:t>
+        <w:t>switch1 ansible_host=10.106.106.63</w:t>
         <w:br/>
         <w:br/>
         <w:t>[network:children]</w:t>
@@ -2029,7 +2035,7 @@
           <w:color w:val="1A1A1A"/>
           <w:sz w:val="16"/>
         </w:rPr>
-        <w:t>NETBOX_URL   = 'http://10.0.0.100:8000'</w:t>
+        <w:t>NETBOX_URL   = 'http://10.100.100.25:8000'</w:t>
         <w:br/>
         <w:t>NETBOX_TOKEN = 'your_token_here'</w:t>
         <w:br/>
@@ -2898,7 +2904,7 @@
           <w:color w:val="808080"/>
           <w:sz w:val="18"/>
         </w:rPr>
-        <w:t>Network Automation Bootcamp v2.0  ·  May 2026  ·  10–12 Students</w:t>
+        <w:t>Network Automation Bootcamp v2.0  ·  July 2026  ·  10–12 Students</w:t>
       </w:r>
     </w:p>
     <w:sectPr>

</xml_diff>